<commit_message>
Fix EAP physical model compliance
</commit_message>
<xml_diff>
--- a/Jousaali_infosusteemi_treeningute_funktsionaalne_allsusteem.docx
+++ b/Jousaali_infosusteemi_treeningute_funktsionaalne_allsusteem.docx
@@ -1279,6 +1279,1479 @@
     <w:p/>
     <w:p>
       <w:pPr>
+        <w:pStyle w:val="Heading2"/>
+      </w:pPr>
+      <w:r>
+        <w:t>CRUD-maatriks põhiobjektide ja kasutusjuhtude lõikes</w:t>
+      </w:r>
+    </w:p>
+    <w:p>
+      <w:r>
+        <w:rPr>
+          <w:b/>
+        </w:rPr>
+        <w:t>Tabel 3. CRUD-maatriks põhiobjektide ja kasutusjuhtude lõikes</w:t>
+      </w:r>
+    </w:p>
+    <w:tbl>
+      <w:tblPr>
+        <w:tblStyle w:val="TableGrid"/>
+        <w:tblW w:type="auto" w:w="0"/>
+        <w:tblLayout w:type="autofit"/>
+        <w:tblLook w:firstColumn="1" w:firstRow="1" w:lastColumn="0" w:lastRow="0" w:noHBand="0" w:noVBand="1" w:val="04A0"/>
+      </w:tblPr>
+      <w:tblGrid>
+        <w:gridCol w:w="1206"/>
+        <w:gridCol w:w="1206"/>
+        <w:gridCol w:w="1206"/>
+        <w:gridCol w:w="1206"/>
+        <w:gridCol w:w="1206"/>
+        <w:gridCol w:w="1206"/>
+        <w:gridCol w:w="1206"/>
+        <w:gridCol w:w="1206"/>
+      </w:tblGrid>
+      <w:tr>
+        <w:tc>
+          <w:tcPr>
+            <w:tcW w:type="dxa" w:w="1206"/>
+            <w:shd w:fill="D9EAF7"/>
+            <w:vAlign w:val="center"/>
+          </w:tcPr>
+          <w:p>
+            <w:r/>
+            <w:r>
+              <w:rPr>
+                <w:b/>
+                <w:sz w:val="18"/>
+              </w:rPr>
+              <w:t>Kasutusjuht</w:t>
+            </w:r>
+          </w:p>
+        </w:tc>
+        <w:tc>
+          <w:tcPr>
+            <w:tcW w:type="dxa" w:w="1206"/>
+            <w:shd w:fill="D9EAF7"/>
+            <w:vAlign w:val="center"/>
+          </w:tcPr>
+          <w:p>
+            <w:r/>
+            <w:r>
+              <w:rPr>
+                <w:b/>
+                <w:sz w:val="18"/>
+              </w:rPr>
+              <w:t>treeninguliik</w:t>
+            </w:r>
+          </w:p>
+        </w:tc>
+        <w:tc>
+          <w:tcPr>
+            <w:tcW w:type="dxa" w:w="1206"/>
+            <w:shd w:fill="D9EAF7"/>
+            <w:vAlign w:val="center"/>
+          </w:tcPr>
+          <w:p>
+            <w:r/>
+            <w:r>
+              <w:rPr>
+                <w:b/>
+                <w:sz w:val="18"/>
+              </w:rPr>
+              <w:t>treeningukord</w:t>
+            </w:r>
+          </w:p>
+        </w:tc>
+        <w:tc>
+          <w:tcPr>
+            <w:tcW w:type="dxa" w:w="1206"/>
+            <w:shd w:fill="D9EAF7"/>
+            <w:vAlign w:val="center"/>
+          </w:tcPr>
+          <w:p>
+            <w:r/>
+            <w:r>
+              <w:rPr>
+                <w:b/>
+                <w:sz w:val="18"/>
+              </w:rPr>
+              <w:t>ruum</w:t>
+            </w:r>
+          </w:p>
+        </w:tc>
+        <w:tc>
+          <w:tcPr>
+            <w:tcW w:type="dxa" w:w="1206"/>
+            <w:shd w:fill="D9EAF7"/>
+            <w:vAlign w:val="center"/>
+          </w:tcPr>
+          <w:p>
+            <w:r/>
+            <w:r>
+              <w:rPr>
+                <w:b/>
+                <w:sz w:val="18"/>
+              </w:rPr>
+              <w:t>treeneri_padevus</w:t>
+            </w:r>
+          </w:p>
+        </w:tc>
+        <w:tc>
+          <w:tcPr>
+            <w:tcW w:type="dxa" w:w="1206"/>
+            <w:shd w:fill="D9EAF7"/>
+            <w:vAlign w:val="center"/>
+          </w:tcPr>
+          <w:p>
+            <w:r/>
+            <w:r>
+              <w:rPr>
+                <w:b/>
+                <w:sz w:val="18"/>
+              </w:rPr>
+              <w:t>klient</w:t>
+            </w:r>
+          </w:p>
+        </w:tc>
+        <w:tc>
+          <w:tcPr>
+            <w:tcW w:type="dxa" w:w="1206"/>
+            <w:shd w:fill="D9EAF7"/>
+            <w:vAlign w:val="center"/>
+          </w:tcPr>
+          <w:p>
+            <w:r/>
+            <w:r>
+              <w:rPr>
+                <w:b/>
+                <w:sz w:val="18"/>
+              </w:rPr>
+              <w:t>registreering</w:t>
+            </w:r>
+          </w:p>
+        </w:tc>
+        <w:tc>
+          <w:tcPr>
+            <w:tcW w:type="dxa" w:w="1206"/>
+            <w:shd w:fill="D9EAF7"/>
+            <w:vAlign w:val="center"/>
+          </w:tcPr>
+          <w:p>
+            <w:r/>
+            <w:r>
+              <w:rPr>
+                <w:b/>
+                <w:sz w:val="18"/>
+              </w:rPr>
+              <w:t>osalemine</w:t>
+            </w:r>
+          </w:p>
+        </w:tc>
+      </w:tr>
+      <w:tr>
+        <w:tc>
+          <w:tcPr>
+            <w:tcW w:type="dxa" w:w="1206"/>
+            <w:vAlign w:val="center"/>
+          </w:tcPr>
+          <w:p>
+            <w:r/>
+            <w:r>
+              <w:rPr>
+                <w:b w:val="0"/>
+                <w:sz w:val="18"/>
+              </w:rPr>
+              <w:t>Treeningukorra planeerimine</w:t>
+            </w:r>
+          </w:p>
+        </w:tc>
+        <w:tc>
+          <w:tcPr>
+            <w:tcW w:type="dxa" w:w="1206"/>
+            <w:vAlign w:val="center"/>
+          </w:tcPr>
+          <w:p>
+            <w:r/>
+            <w:r>
+              <w:rPr>
+                <w:b w:val="0"/>
+                <w:sz w:val="18"/>
+              </w:rPr>
+              <w:t>R</w:t>
+            </w:r>
+          </w:p>
+        </w:tc>
+        <w:tc>
+          <w:tcPr>
+            <w:tcW w:type="dxa" w:w="1206"/>
+            <w:vAlign w:val="center"/>
+          </w:tcPr>
+          <w:p>
+            <w:r/>
+            <w:r>
+              <w:rPr>
+                <w:b w:val="0"/>
+                <w:sz w:val="18"/>
+              </w:rPr>
+              <w:t>C</w:t>
+            </w:r>
+          </w:p>
+        </w:tc>
+        <w:tc>
+          <w:tcPr>
+            <w:tcW w:type="dxa" w:w="1206"/>
+            <w:vAlign w:val="center"/>
+          </w:tcPr>
+          <w:p>
+            <w:r/>
+            <w:r>
+              <w:rPr>
+                <w:b w:val="0"/>
+                <w:sz w:val="18"/>
+              </w:rPr>
+              <w:t>R</w:t>
+            </w:r>
+          </w:p>
+        </w:tc>
+        <w:tc>
+          <w:tcPr>
+            <w:tcW w:type="dxa" w:w="1206"/>
+            <w:vAlign w:val="center"/>
+          </w:tcPr>
+          <w:p>
+            <w:r/>
+            <w:r>
+              <w:rPr>
+                <w:b w:val="0"/>
+                <w:sz w:val="18"/>
+              </w:rPr>
+              <w:t>R</w:t>
+            </w:r>
+          </w:p>
+        </w:tc>
+        <w:tc>
+          <w:tcPr>
+            <w:tcW w:type="dxa" w:w="1206"/>
+            <w:vAlign w:val="center"/>
+          </w:tcPr>
+          <w:p>
+            <w:r/>
+            <w:r>
+              <w:rPr>
+                <w:b w:val="0"/>
+                <w:sz w:val="18"/>
+              </w:rPr>
+              <w:t>-</w:t>
+            </w:r>
+          </w:p>
+        </w:tc>
+        <w:tc>
+          <w:tcPr>
+            <w:tcW w:type="dxa" w:w="1206"/>
+            <w:vAlign w:val="center"/>
+          </w:tcPr>
+          <w:p>
+            <w:r/>
+            <w:r>
+              <w:rPr>
+                <w:b w:val="0"/>
+                <w:sz w:val="18"/>
+              </w:rPr>
+              <w:t>-</w:t>
+            </w:r>
+          </w:p>
+        </w:tc>
+        <w:tc>
+          <w:tcPr>
+            <w:tcW w:type="dxa" w:w="1206"/>
+            <w:vAlign w:val="center"/>
+          </w:tcPr>
+          <w:p>
+            <w:r/>
+            <w:r>
+              <w:rPr>
+                <w:b w:val="0"/>
+                <w:sz w:val="18"/>
+              </w:rPr>
+              <w:t>-</w:t>
+            </w:r>
+          </w:p>
+        </w:tc>
+      </w:tr>
+      <w:tr>
+        <w:tc>
+          <w:tcPr>
+            <w:tcW w:type="dxa" w:w="1206"/>
+            <w:vAlign w:val="center"/>
+          </w:tcPr>
+          <w:p>
+            <w:r/>
+            <w:r>
+              <w:rPr>
+                <w:b w:val="0"/>
+                <w:sz w:val="18"/>
+              </w:rPr>
+              <w:t>Registreerimise avamine</w:t>
+            </w:r>
+          </w:p>
+        </w:tc>
+        <w:tc>
+          <w:tcPr>
+            <w:tcW w:type="dxa" w:w="1206"/>
+            <w:vAlign w:val="center"/>
+          </w:tcPr>
+          <w:p>
+            <w:r/>
+            <w:r>
+              <w:rPr>
+                <w:b w:val="0"/>
+                <w:sz w:val="18"/>
+              </w:rPr>
+              <w:t>R</w:t>
+            </w:r>
+          </w:p>
+        </w:tc>
+        <w:tc>
+          <w:tcPr>
+            <w:tcW w:type="dxa" w:w="1206"/>
+            <w:vAlign w:val="center"/>
+          </w:tcPr>
+          <w:p>
+            <w:r/>
+            <w:r>
+              <w:rPr>
+                <w:b w:val="0"/>
+                <w:sz w:val="18"/>
+              </w:rPr>
+              <w:t>U</w:t>
+            </w:r>
+          </w:p>
+        </w:tc>
+        <w:tc>
+          <w:tcPr>
+            <w:tcW w:type="dxa" w:w="1206"/>
+            <w:vAlign w:val="center"/>
+          </w:tcPr>
+          <w:p>
+            <w:r/>
+            <w:r>
+              <w:rPr>
+                <w:b w:val="0"/>
+                <w:sz w:val="18"/>
+              </w:rPr>
+              <w:t>-</w:t>
+            </w:r>
+          </w:p>
+        </w:tc>
+        <w:tc>
+          <w:tcPr>
+            <w:tcW w:type="dxa" w:w="1206"/>
+            <w:vAlign w:val="center"/>
+          </w:tcPr>
+          <w:p>
+            <w:r/>
+            <w:r>
+              <w:rPr>
+                <w:b w:val="0"/>
+                <w:sz w:val="18"/>
+              </w:rPr>
+              <w:t>-</w:t>
+            </w:r>
+          </w:p>
+        </w:tc>
+        <w:tc>
+          <w:tcPr>
+            <w:tcW w:type="dxa" w:w="1206"/>
+            <w:vAlign w:val="center"/>
+          </w:tcPr>
+          <w:p>
+            <w:r/>
+            <w:r>
+              <w:rPr>
+                <w:b w:val="0"/>
+                <w:sz w:val="18"/>
+              </w:rPr>
+              <w:t>-</w:t>
+            </w:r>
+          </w:p>
+        </w:tc>
+        <w:tc>
+          <w:tcPr>
+            <w:tcW w:type="dxa" w:w="1206"/>
+            <w:vAlign w:val="center"/>
+          </w:tcPr>
+          <w:p>
+            <w:r/>
+            <w:r>
+              <w:rPr>
+                <w:b w:val="0"/>
+                <w:sz w:val="18"/>
+              </w:rPr>
+              <w:t>-</w:t>
+            </w:r>
+          </w:p>
+        </w:tc>
+        <w:tc>
+          <w:tcPr>
+            <w:tcW w:type="dxa" w:w="1206"/>
+            <w:vAlign w:val="center"/>
+          </w:tcPr>
+          <w:p>
+            <w:r/>
+            <w:r>
+              <w:rPr>
+                <w:b w:val="0"/>
+                <w:sz w:val="18"/>
+              </w:rPr>
+              <w:t>-</w:t>
+            </w:r>
+          </w:p>
+        </w:tc>
+      </w:tr>
+      <w:tr>
+        <w:tc>
+          <w:tcPr>
+            <w:tcW w:type="dxa" w:w="1206"/>
+            <w:vAlign w:val="center"/>
+          </w:tcPr>
+          <w:p>
+            <w:r/>
+            <w:r>
+              <w:rPr>
+                <w:b w:val="0"/>
+                <w:sz w:val="18"/>
+              </w:rPr>
+              <w:t>Kliendi registreerimine treeningukorrale</w:t>
+            </w:r>
+          </w:p>
+        </w:tc>
+        <w:tc>
+          <w:tcPr>
+            <w:tcW w:type="dxa" w:w="1206"/>
+            <w:vAlign w:val="center"/>
+          </w:tcPr>
+          <w:p>
+            <w:r/>
+            <w:r>
+              <w:rPr>
+                <w:b w:val="0"/>
+                <w:sz w:val="18"/>
+              </w:rPr>
+              <w:t>R</w:t>
+            </w:r>
+          </w:p>
+        </w:tc>
+        <w:tc>
+          <w:tcPr>
+            <w:tcW w:type="dxa" w:w="1206"/>
+            <w:vAlign w:val="center"/>
+          </w:tcPr>
+          <w:p>
+            <w:r/>
+            <w:r>
+              <w:rPr>
+                <w:b w:val="0"/>
+                <w:sz w:val="18"/>
+              </w:rPr>
+              <w:t>R</w:t>
+            </w:r>
+          </w:p>
+        </w:tc>
+        <w:tc>
+          <w:tcPr>
+            <w:tcW w:type="dxa" w:w="1206"/>
+            <w:vAlign w:val="center"/>
+          </w:tcPr>
+          <w:p>
+            <w:r/>
+            <w:r>
+              <w:rPr>
+                <w:b w:val="0"/>
+                <w:sz w:val="18"/>
+              </w:rPr>
+              <w:t>R</w:t>
+            </w:r>
+          </w:p>
+        </w:tc>
+        <w:tc>
+          <w:tcPr>
+            <w:tcW w:type="dxa" w:w="1206"/>
+            <w:vAlign w:val="center"/>
+          </w:tcPr>
+          <w:p>
+            <w:r/>
+            <w:r>
+              <w:rPr>
+                <w:b w:val="0"/>
+                <w:sz w:val="18"/>
+              </w:rPr>
+              <w:t>-</w:t>
+            </w:r>
+          </w:p>
+        </w:tc>
+        <w:tc>
+          <w:tcPr>
+            <w:tcW w:type="dxa" w:w="1206"/>
+            <w:vAlign w:val="center"/>
+          </w:tcPr>
+          <w:p>
+            <w:r/>
+            <w:r>
+              <w:rPr>
+                <w:b w:val="0"/>
+                <w:sz w:val="18"/>
+              </w:rPr>
+              <w:t>R</w:t>
+            </w:r>
+          </w:p>
+        </w:tc>
+        <w:tc>
+          <w:tcPr>
+            <w:tcW w:type="dxa" w:w="1206"/>
+            <w:vAlign w:val="center"/>
+          </w:tcPr>
+          <w:p>
+            <w:r/>
+            <w:r>
+              <w:rPr>
+                <w:b w:val="0"/>
+                <w:sz w:val="18"/>
+              </w:rPr>
+              <w:t>C</w:t>
+            </w:r>
+          </w:p>
+        </w:tc>
+        <w:tc>
+          <w:tcPr>
+            <w:tcW w:type="dxa" w:w="1206"/>
+            <w:vAlign w:val="center"/>
+          </w:tcPr>
+          <w:p>
+            <w:r/>
+            <w:r>
+              <w:rPr>
+                <w:b w:val="0"/>
+                <w:sz w:val="18"/>
+              </w:rPr>
+              <w:t>-</w:t>
+            </w:r>
+          </w:p>
+        </w:tc>
+      </w:tr>
+      <w:tr>
+        <w:tc>
+          <w:tcPr>
+            <w:tcW w:type="dxa" w:w="1206"/>
+            <w:vAlign w:val="center"/>
+          </w:tcPr>
+          <w:p>
+            <w:r/>
+            <w:r>
+              <w:rPr>
+                <w:b w:val="0"/>
+                <w:sz w:val="18"/>
+              </w:rPr>
+              <w:t>Registreeringu tühistamine</w:t>
+            </w:r>
+          </w:p>
+        </w:tc>
+        <w:tc>
+          <w:tcPr>
+            <w:tcW w:type="dxa" w:w="1206"/>
+            <w:vAlign w:val="center"/>
+          </w:tcPr>
+          <w:p>
+            <w:r/>
+            <w:r>
+              <w:rPr>
+                <w:b w:val="0"/>
+                <w:sz w:val="18"/>
+              </w:rPr>
+              <w:t>-</w:t>
+            </w:r>
+          </w:p>
+        </w:tc>
+        <w:tc>
+          <w:tcPr>
+            <w:tcW w:type="dxa" w:w="1206"/>
+            <w:vAlign w:val="center"/>
+          </w:tcPr>
+          <w:p>
+            <w:r/>
+            <w:r>
+              <w:rPr>
+                <w:b w:val="0"/>
+                <w:sz w:val="18"/>
+              </w:rPr>
+              <w:t>R</w:t>
+            </w:r>
+          </w:p>
+        </w:tc>
+        <w:tc>
+          <w:tcPr>
+            <w:tcW w:type="dxa" w:w="1206"/>
+            <w:vAlign w:val="center"/>
+          </w:tcPr>
+          <w:p>
+            <w:r/>
+            <w:r>
+              <w:rPr>
+                <w:b w:val="0"/>
+                <w:sz w:val="18"/>
+              </w:rPr>
+              <w:t>-</w:t>
+            </w:r>
+          </w:p>
+        </w:tc>
+        <w:tc>
+          <w:tcPr>
+            <w:tcW w:type="dxa" w:w="1206"/>
+            <w:vAlign w:val="center"/>
+          </w:tcPr>
+          <w:p>
+            <w:r/>
+            <w:r>
+              <w:rPr>
+                <w:b w:val="0"/>
+                <w:sz w:val="18"/>
+              </w:rPr>
+              <w:t>-</w:t>
+            </w:r>
+          </w:p>
+        </w:tc>
+        <w:tc>
+          <w:tcPr>
+            <w:tcW w:type="dxa" w:w="1206"/>
+            <w:vAlign w:val="center"/>
+          </w:tcPr>
+          <w:p>
+            <w:r/>
+            <w:r>
+              <w:rPr>
+                <w:b w:val="0"/>
+                <w:sz w:val="18"/>
+              </w:rPr>
+              <w:t>R</w:t>
+            </w:r>
+          </w:p>
+        </w:tc>
+        <w:tc>
+          <w:tcPr>
+            <w:tcW w:type="dxa" w:w="1206"/>
+            <w:vAlign w:val="center"/>
+          </w:tcPr>
+          <w:p>
+            <w:r/>
+            <w:r>
+              <w:rPr>
+                <w:b w:val="0"/>
+                <w:sz w:val="18"/>
+              </w:rPr>
+              <w:t>U</w:t>
+            </w:r>
+          </w:p>
+        </w:tc>
+        <w:tc>
+          <w:tcPr>
+            <w:tcW w:type="dxa" w:w="1206"/>
+            <w:vAlign w:val="center"/>
+          </w:tcPr>
+          <w:p>
+            <w:r/>
+            <w:r>
+              <w:rPr>
+                <w:b w:val="0"/>
+                <w:sz w:val="18"/>
+              </w:rPr>
+              <w:t>-</w:t>
+            </w:r>
+          </w:p>
+        </w:tc>
+      </w:tr>
+      <w:tr>
+        <w:tc>
+          <w:tcPr>
+            <w:tcW w:type="dxa" w:w="1206"/>
+            <w:vAlign w:val="center"/>
+          </w:tcPr>
+          <w:p>
+            <w:r/>
+            <w:r>
+              <w:rPr>
+                <w:b w:val="0"/>
+                <w:sz w:val="18"/>
+              </w:rPr>
+              <w:t>Ootejärjekorrast edendamine</w:t>
+            </w:r>
+          </w:p>
+        </w:tc>
+        <w:tc>
+          <w:tcPr>
+            <w:tcW w:type="dxa" w:w="1206"/>
+            <w:vAlign w:val="center"/>
+          </w:tcPr>
+          <w:p>
+            <w:r/>
+            <w:r>
+              <w:rPr>
+                <w:b w:val="0"/>
+                <w:sz w:val="18"/>
+              </w:rPr>
+              <w:t>-</w:t>
+            </w:r>
+          </w:p>
+        </w:tc>
+        <w:tc>
+          <w:tcPr>
+            <w:tcW w:type="dxa" w:w="1206"/>
+            <w:vAlign w:val="center"/>
+          </w:tcPr>
+          <w:p>
+            <w:r/>
+            <w:r>
+              <w:rPr>
+                <w:b w:val="0"/>
+                <w:sz w:val="18"/>
+              </w:rPr>
+              <w:t>R</w:t>
+            </w:r>
+          </w:p>
+        </w:tc>
+        <w:tc>
+          <w:tcPr>
+            <w:tcW w:type="dxa" w:w="1206"/>
+            <w:vAlign w:val="center"/>
+          </w:tcPr>
+          <w:p>
+            <w:r/>
+            <w:r>
+              <w:rPr>
+                <w:b w:val="0"/>
+                <w:sz w:val="18"/>
+              </w:rPr>
+              <w:t>-</w:t>
+            </w:r>
+          </w:p>
+        </w:tc>
+        <w:tc>
+          <w:tcPr>
+            <w:tcW w:type="dxa" w:w="1206"/>
+            <w:vAlign w:val="center"/>
+          </w:tcPr>
+          <w:p>
+            <w:r/>
+            <w:r>
+              <w:rPr>
+                <w:b w:val="0"/>
+                <w:sz w:val="18"/>
+              </w:rPr>
+              <w:t>-</w:t>
+            </w:r>
+          </w:p>
+        </w:tc>
+        <w:tc>
+          <w:tcPr>
+            <w:tcW w:type="dxa" w:w="1206"/>
+            <w:vAlign w:val="center"/>
+          </w:tcPr>
+          <w:p>
+            <w:r/>
+            <w:r>
+              <w:rPr>
+                <w:b w:val="0"/>
+                <w:sz w:val="18"/>
+              </w:rPr>
+              <w:t>R</w:t>
+            </w:r>
+          </w:p>
+        </w:tc>
+        <w:tc>
+          <w:tcPr>
+            <w:tcW w:type="dxa" w:w="1206"/>
+            <w:vAlign w:val="center"/>
+          </w:tcPr>
+          <w:p>
+            <w:r/>
+            <w:r>
+              <w:rPr>
+                <w:b w:val="0"/>
+                <w:sz w:val="18"/>
+              </w:rPr>
+              <w:t>U</w:t>
+            </w:r>
+          </w:p>
+        </w:tc>
+        <w:tc>
+          <w:tcPr>
+            <w:tcW w:type="dxa" w:w="1206"/>
+            <w:vAlign w:val="center"/>
+          </w:tcPr>
+          <w:p>
+            <w:r/>
+            <w:r>
+              <w:rPr>
+                <w:b w:val="0"/>
+                <w:sz w:val="18"/>
+              </w:rPr>
+              <w:t>-</w:t>
+            </w:r>
+          </w:p>
+        </w:tc>
+      </w:tr>
+      <w:tr>
+        <w:tc>
+          <w:tcPr>
+            <w:tcW w:type="dxa" w:w="1206"/>
+            <w:vAlign w:val="center"/>
+          </w:tcPr>
+          <w:p>
+            <w:r/>
+            <w:r>
+              <w:rPr>
+                <w:b w:val="0"/>
+                <w:sz w:val="18"/>
+              </w:rPr>
+              <w:t>Osalemise märkimine</w:t>
+            </w:r>
+          </w:p>
+        </w:tc>
+        <w:tc>
+          <w:tcPr>
+            <w:tcW w:type="dxa" w:w="1206"/>
+            <w:vAlign w:val="center"/>
+          </w:tcPr>
+          <w:p>
+            <w:r/>
+            <w:r>
+              <w:rPr>
+                <w:b w:val="0"/>
+                <w:sz w:val="18"/>
+              </w:rPr>
+              <w:t>-</w:t>
+            </w:r>
+          </w:p>
+        </w:tc>
+        <w:tc>
+          <w:tcPr>
+            <w:tcW w:type="dxa" w:w="1206"/>
+            <w:vAlign w:val="center"/>
+          </w:tcPr>
+          <w:p>
+            <w:r/>
+            <w:r>
+              <w:rPr>
+                <w:b w:val="0"/>
+                <w:sz w:val="18"/>
+              </w:rPr>
+              <w:t>R</w:t>
+            </w:r>
+          </w:p>
+        </w:tc>
+        <w:tc>
+          <w:tcPr>
+            <w:tcW w:type="dxa" w:w="1206"/>
+            <w:vAlign w:val="center"/>
+          </w:tcPr>
+          <w:p>
+            <w:r/>
+            <w:r>
+              <w:rPr>
+                <w:b w:val="0"/>
+                <w:sz w:val="18"/>
+              </w:rPr>
+              <w:t>-</w:t>
+            </w:r>
+          </w:p>
+        </w:tc>
+        <w:tc>
+          <w:tcPr>
+            <w:tcW w:type="dxa" w:w="1206"/>
+            <w:vAlign w:val="center"/>
+          </w:tcPr>
+          <w:p>
+            <w:r/>
+            <w:r>
+              <w:rPr>
+                <w:b w:val="0"/>
+                <w:sz w:val="18"/>
+              </w:rPr>
+              <w:t>-</w:t>
+            </w:r>
+          </w:p>
+        </w:tc>
+        <w:tc>
+          <w:tcPr>
+            <w:tcW w:type="dxa" w:w="1206"/>
+            <w:vAlign w:val="center"/>
+          </w:tcPr>
+          <w:p>
+            <w:r/>
+            <w:r>
+              <w:rPr>
+                <w:b w:val="0"/>
+                <w:sz w:val="18"/>
+              </w:rPr>
+              <w:t>R</w:t>
+            </w:r>
+          </w:p>
+        </w:tc>
+        <w:tc>
+          <w:tcPr>
+            <w:tcW w:type="dxa" w:w="1206"/>
+            <w:vAlign w:val="center"/>
+          </w:tcPr>
+          <w:p>
+            <w:r/>
+            <w:r>
+              <w:rPr>
+                <w:b w:val="0"/>
+                <w:sz w:val="18"/>
+              </w:rPr>
+              <w:t>R</w:t>
+            </w:r>
+          </w:p>
+        </w:tc>
+        <w:tc>
+          <w:tcPr>
+            <w:tcW w:type="dxa" w:w="1206"/>
+            <w:vAlign w:val="center"/>
+          </w:tcPr>
+          <w:p>
+            <w:r/>
+            <w:r>
+              <w:rPr>
+                <w:b w:val="0"/>
+                <w:sz w:val="18"/>
+              </w:rPr>
+              <w:t>C/U</w:t>
+            </w:r>
+          </w:p>
+        </w:tc>
+      </w:tr>
+      <w:tr>
+        <w:tc>
+          <w:tcPr>
+            <w:tcW w:type="dxa" w:w="1206"/>
+            <w:vAlign w:val="center"/>
+          </w:tcPr>
+          <w:p>
+            <w:r/>
+            <w:r>
+              <w:rPr>
+                <w:b w:val="0"/>
+                <w:sz w:val="18"/>
+              </w:rPr>
+              <w:t>Treeningukorra tühistamine</w:t>
+            </w:r>
+          </w:p>
+        </w:tc>
+        <w:tc>
+          <w:tcPr>
+            <w:tcW w:type="dxa" w:w="1206"/>
+            <w:vAlign w:val="center"/>
+          </w:tcPr>
+          <w:p>
+            <w:r/>
+            <w:r>
+              <w:rPr>
+                <w:b w:val="0"/>
+                <w:sz w:val="18"/>
+              </w:rPr>
+              <w:t>-</w:t>
+            </w:r>
+          </w:p>
+        </w:tc>
+        <w:tc>
+          <w:tcPr>
+            <w:tcW w:type="dxa" w:w="1206"/>
+            <w:vAlign w:val="center"/>
+          </w:tcPr>
+          <w:p>
+            <w:r/>
+            <w:r>
+              <w:rPr>
+                <w:b w:val="0"/>
+                <w:sz w:val="18"/>
+              </w:rPr>
+              <w:t>U</w:t>
+            </w:r>
+          </w:p>
+        </w:tc>
+        <w:tc>
+          <w:tcPr>
+            <w:tcW w:type="dxa" w:w="1206"/>
+            <w:vAlign w:val="center"/>
+          </w:tcPr>
+          <w:p>
+            <w:r/>
+            <w:r>
+              <w:rPr>
+                <w:b w:val="0"/>
+                <w:sz w:val="18"/>
+              </w:rPr>
+              <w:t>-</w:t>
+            </w:r>
+          </w:p>
+        </w:tc>
+        <w:tc>
+          <w:tcPr>
+            <w:tcW w:type="dxa" w:w="1206"/>
+            <w:vAlign w:val="center"/>
+          </w:tcPr>
+          <w:p>
+            <w:r/>
+            <w:r>
+              <w:rPr>
+                <w:b w:val="0"/>
+                <w:sz w:val="18"/>
+              </w:rPr>
+              <w:t>-</w:t>
+            </w:r>
+          </w:p>
+        </w:tc>
+        <w:tc>
+          <w:tcPr>
+            <w:tcW w:type="dxa" w:w="1206"/>
+            <w:vAlign w:val="center"/>
+          </w:tcPr>
+          <w:p>
+            <w:r/>
+            <w:r>
+              <w:rPr>
+                <w:b w:val="0"/>
+                <w:sz w:val="18"/>
+              </w:rPr>
+              <w:t>-</w:t>
+            </w:r>
+          </w:p>
+        </w:tc>
+        <w:tc>
+          <w:tcPr>
+            <w:tcW w:type="dxa" w:w="1206"/>
+            <w:vAlign w:val="center"/>
+          </w:tcPr>
+          <w:p>
+            <w:r/>
+            <w:r>
+              <w:rPr>
+                <w:b w:val="0"/>
+                <w:sz w:val="18"/>
+              </w:rPr>
+              <w:t>U</w:t>
+            </w:r>
+          </w:p>
+        </w:tc>
+        <w:tc>
+          <w:tcPr>
+            <w:tcW w:type="dxa" w:w="1206"/>
+            <w:vAlign w:val="center"/>
+          </w:tcPr>
+          <w:p>
+            <w:r/>
+            <w:r>
+              <w:rPr>
+                <w:b w:val="0"/>
+                <w:sz w:val="18"/>
+              </w:rPr>
+              <w:t>-</w:t>
+            </w:r>
+          </w:p>
+        </w:tc>
+      </w:tr>
+      <w:tr>
+        <w:tc>
+          <w:tcPr>
+            <w:tcW w:type="dxa" w:w="1206"/>
+            <w:vAlign w:val="center"/>
+          </w:tcPr>
+          <w:p>
+            <w:r/>
+            <w:r>
+              <w:rPr>
+                <w:b w:val="0"/>
+                <w:sz w:val="18"/>
+              </w:rPr>
+              <w:t>Juhataja aruande vaatamine</w:t>
+            </w:r>
+          </w:p>
+        </w:tc>
+        <w:tc>
+          <w:tcPr>
+            <w:tcW w:type="dxa" w:w="1206"/>
+            <w:vAlign w:val="center"/>
+          </w:tcPr>
+          <w:p>
+            <w:r/>
+            <w:r>
+              <w:rPr>
+                <w:b w:val="0"/>
+                <w:sz w:val="18"/>
+              </w:rPr>
+              <w:t>R</w:t>
+            </w:r>
+          </w:p>
+        </w:tc>
+        <w:tc>
+          <w:tcPr>
+            <w:tcW w:type="dxa" w:w="1206"/>
+            <w:vAlign w:val="center"/>
+          </w:tcPr>
+          <w:p>
+            <w:r/>
+            <w:r>
+              <w:rPr>
+                <w:b w:val="0"/>
+                <w:sz w:val="18"/>
+              </w:rPr>
+              <w:t>R</w:t>
+            </w:r>
+          </w:p>
+        </w:tc>
+        <w:tc>
+          <w:tcPr>
+            <w:tcW w:type="dxa" w:w="1206"/>
+            <w:vAlign w:val="center"/>
+          </w:tcPr>
+          <w:p>
+            <w:r/>
+            <w:r>
+              <w:rPr>
+                <w:b w:val="0"/>
+                <w:sz w:val="18"/>
+              </w:rPr>
+              <w:t>R</w:t>
+            </w:r>
+          </w:p>
+        </w:tc>
+        <w:tc>
+          <w:tcPr>
+            <w:tcW w:type="dxa" w:w="1206"/>
+            <w:vAlign w:val="center"/>
+          </w:tcPr>
+          <w:p>
+            <w:r/>
+            <w:r>
+              <w:rPr>
+                <w:b w:val="0"/>
+                <w:sz w:val="18"/>
+              </w:rPr>
+              <w:t>R</w:t>
+            </w:r>
+          </w:p>
+        </w:tc>
+        <w:tc>
+          <w:tcPr>
+            <w:tcW w:type="dxa" w:w="1206"/>
+            <w:vAlign w:val="center"/>
+          </w:tcPr>
+          <w:p>
+            <w:r/>
+            <w:r>
+              <w:rPr>
+                <w:b w:val="0"/>
+                <w:sz w:val="18"/>
+              </w:rPr>
+              <w:t>-</w:t>
+            </w:r>
+          </w:p>
+        </w:tc>
+        <w:tc>
+          <w:tcPr>
+            <w:tcW w:type="dxa" w:w="1206"/>
+            <w:vAlign w:val="center"/>
+          </w:tcPr>
+          <w:p>
+            <w:r/>
+            <w:r>
+              <w:rPr>
+                <w:b w:val="0"/>
+                <w:sz w:val="18"/>
+              </w:rPr>
+              <w:t>R</w:t>
+            </w:r>
+          </w:p>
+        </w:tc>
+        <w:tc>
+          <w:tcPr>
+            <w:tcW w:type="dxa" w:w="1206"/>
+            <w:vAlign w:val="center"/>
+          </w:tcPr>
+          <w:p>
+            <w:r/>
+            <w:r>
+              <w:rPr>
+                <w:b w:val="0"/>
+                <w:sz w:val="18"/>
+              </w:rPr>
+              <w:t>R</w:t>
+            </w:r>
+          </w:p>
+        </w:tc>
+      </w:tr>
+      <w:tr>
+        <w:tc>
+          <w:tcPr>
+            <w:tcW w:type="dxa" w:w="1206"/>
+            <w:vAlign w:val="center"/>
+          </w:tcPr>
+          <w:p>
+            <w:r/>
+            <w:r>
+              <w:rPr>
+                <w:b w:val="0"/>
+                <w:sz w:val="18"/>
+              </w:rPr>
+              <w:t>Treeneri tunniplaani vaatamine</w:t>
+            </w:r>
+          </w:p>
+        </w:tc>
+        <w:tc>
+          <w:tcPr>
+            <w:tcW w:type="dxa" w:w="1206"/>
+            <w:vAlign w:val="center"/>
+          </w:tcPr>
+          <w:p>
+            <w:r/>
+            <w:r>
+              <w:rPr>
+                <w:b w:val="0"/>
+                <w:sz w:val="18"/>
+              </w:rPr>
+              <w:t>R</w:t>
+            </w:r>
+          </w:p>
+        </w:tc>
+        <w:tc>
+          <w:tcPr>
+            <w:tcW w:type="dxa" w:w="1206"/>
+            <w:vAlign w:val="center"/>
+          </w:tcPr>
+          <w:p>
+            <w:r/>
+            <w:r>
+              <w:rPr>
+                <w:b w:val="0"/>
+                <w:sz w:val="18"/>
+              </w:rPr>
+              <w:t>R</w:t>
+            </w:r>
+          </w:p>
+        </w:tc>
+        <w:tc>
+          <w:tcPr>
+            <w:tcW w:type="dxa" w:w="1206"/>
+            <w:vAlign w:val="center"/>
+          </w:tcPr>
+          <w:p>
+            <w:r/>
+            <w:r>
+              <w:rPr>
+                <w:b w:val="0"/>
+                <w:sz w:val="18"/>
+              </w:rPr>
+              <w:t>R</w:t>
+            </w:r>
+          </w:p>
+        </w:tc>
+        <w:tc>
+          <w:tcPr>
+            <w:tcW w:type="dxa" w:w="1206"/>
+            <w:vAlign w:val="center"/>
+          </w:tcPr>
+          <w:p>
+            <w:r/>
+            <w:r>
+              <w:rPr>
+                <w:b w:val="0"/>
+                <w:sz w:val="18"/>
+              </w:rPr>
+              <w:t>R</w:t>
+            </w:r>
+          </w:p>
+        </w:tc>
+        <w:tc>
+          <w:tcPr>
+            <w:tcW w:type="dxa" w:w="1206"/>
+            <w:vAlign w:val="center"/>
+          </w:tcPr>
+          <w:p>
+            <w:r/>
+            <w:r>
+              <w:rPr>
+                <w:b w:val="0"/>
+                <w:sz w:val="18"/>
+              </w:rPr>
+              <w:t>-</w:t>
+            </w:r>
+          </w:p>
+        </w:tc>
+        <w:tc>
+          <w:tcPr>
+            <w:tcW w:type="dxa" w:w="1206"/>
+            <w:vAlign w:val="center"/>
+          </w:tcPr>
+          <w:p>
+            <w:r/>
+            <w:r>
+              <w:rPr>
+                <w:b w:val="0"/>
+                <w:sz w:val="18"/>
+              </w:rPr>
+              <w:t>R</w:t>
+            </w:r>
+          </w:p>
+        </w:tc>
+        <w:tc>
+          <w:tcPr>
+            <w:tcW w:type="dxa" w:w="1206"/>
+            <w:vAlign w:val="center"/>
+          </w:tcPr>
+          <w:p>
+            <w:r/>
+            <w:r>
+              <w:rPr>
+                <w:b w:val="0"/>
+                <w:sz w:val="18"/>
+              </w:rPr>
+              <w:t>R</w:t>
+            </w:r>
+          </w:p>
+        </w:tc>
+      </w:tr>
+      <w:tr>
+        <w:tc>
+          <w:tcPr>
+            <w:tcW w:type="dxa" w:w="1206"/>
+            <w:vAlign w:val="center"/>
+          </w:tcPr>
+          <w:p>
+            <w:r/>
+            <w:r>
+              <w:rPr>
+                <w:b w:val="0"/>
+                <w:sz w:val="18"/>
+              </w:rPr>
+              <w:t>Kliendi registreeringute vaatamine</w:t>
+            </w:r>
+          </w:p>
+        </w:tc>
+        <w:tc>
+          <w:tcPr>
+            <w:tcW w:type="dxa" w:w="1206"/>
+            <w:vAlign w:val="center"/>
+          </w:tcPr>
+          <w:p>
+            <w:r/>
+            <w:r>
+              <w:rPr>
+                <w:b w:val="0"/>
+                <w:sz w:val="18"/>
+              </w:rPr>
+              <w:t>R</w:t>
+            </w:r>
+          </w:p>
+        </w:tc>
+        <w:tc>
+          <w:tcPr>
+            <w:tcW w:type="dxa" w:w="1206"/>
+            <w:vAlign w:val="center"/>
+          </w:tcPr>
+          <w:p>
+            <w:r/>
+            <w:r>
+              <w:rPr>
+                <w:b w:val="0"/>
+                <w:sz w:val="18"/>
+              </w:rPr>
+              <w:t>R</w:t>
+            </w:r>
+          </w:p>
+        </w:tc>
+        <w:tc>
+          <w:tcPr>
+            <w:tcW w:type="dxa" w:w="1206"/>
+            <w:vAlign w:val="center"/>
+          </w:tcPr>
+          <w:p>
+            <w:r/>
+            <w:r>
+              <w:rPr>
+                <w:b w:val="0"/>
+                <w:sz w:val="18"/>
+              </w:rPr>
+              <w:t>R</w:t>
+            </w:r>
+          </w:p>
+        </w:tc>
+        <w:tc>
+          <w:tcPr>
+            <w:tcW w:type="dxa" w:w="1206"/>
+            <w:vAlign w:val="center"/>
+          </w:tcPr>
+          <w:p>
+            <w:r/>
+            <w:r>
+              <w:rPr>
+                <w:b w:val="0"/>
+                <w:sz w:val="18"/>
+              </w:rPr>
+              <w:t>-</w:t>
+            </w:r>
+          </w:p>
+        </w:tc>
+        <w:tc>
+          <w:tcPr>
+            <w:tcW w:type="dxa" w:w="1206"/>
+            <w:vAlign w:val="center"/>
+          </w:tcPr>
+          <w:p>
+            <w:r/>
+            <w:r>
+              <w:rPr>
+                <w:b w:val="0"/>
+                <w:sz w:val="18"/>
+              </w:rPr>
+              <w:t>R</w:t>
+            </w:r>
+          </w:p>
+        </w:tc>
+        <w:tc>
+          <w:tcPr>
+            <w:tcW w:type="dxa" w:w="1206"/>
+            <w:vAlign w:val="center"/>
+          </w:tcPr>
+          <w:p>
+            <w:r/>
+            <w:r>
+              <w:rPr>
+                <w:b w:val="0"/>
+                <w:sz w:val="18"/>
+              </w:rPr>
+              <w:t>R</w:t>
+            </w:r>
+          </w:p>
+        </w:tc>
+        <w:tc>
+          <w:tcPr>
+            <w:tcW w:type="dxa" w:w="1206"/>
+            <w:vAlign w:val="center"/>
+          </w:tcPr>
+          <w:p>
+            <w:r/>
+            <w:r>
+              <w:rPr>
+                <w:b w:val="0"/>
+                <w:sz w:val="18"/>
+              </w:rPr>
+              <w:t>R</w:t>
+            </w:r>
+          </w:p>
+        </w:tc>
+      </w:tr>
+    </w:tbl>
+    <w:p/>
+    <w:p>
+      <w:pPr>
         <w:jc w:val="center"/>
       </w:pPr>
       <w:r>
@@ -1453,7 +2926,7 @@
         <w:rPr>
           <w:b/>
         </w:rPr>
-        <w:t>Tabel 3. Põhiobjektid</w:t>
+        <w:t>Tabel 4. Põhiobjektid</w:t>
       </w:r>
     </w:p>
     <w:tbl>
@@ -1812,7 +3285,7 @@
         <w:rPr>
           <w:b/>
         </w:rPr>
-        <w:t>Tabel 4. Treeningukorra lubatud seisundimuudatused</w:t>
+        <w:t>Tabel 5. Treeningukorra lubatud seisundimuudatused</w:t>
       </w:r>
     </w:p>
     <w:tbl>
@@ -2188,7 +3661,7 @@
         <w:rPr>
           <w:b/>
         </w:rPr>
-        <w:t>Tabel 5. Registreeringu lubatud seisundimuudatused</w:t>
+        <w:t>Tabel 6. Registreeringu lubatud seisundimuudatused</w:t>
       </w:r>
     </w:p>
     <w:tbl>
@@ -2521,7 +3994,7 @@
         <w:rPr>
           <w:b/>
         </w:rPr>
-        <w:t>Tabel 6. Andmebaasirutiinide lepingud</w:t>
+        <w:t>Tabel 7. Andmebaasirutiinide lepingud</w:t>
       </w:r>
     </w:p>
     <w:tbl>
@@ -2634,7 +4107,7 @@
                 <w:b w:val="0"/>
                 <w:sz w:val="18"/>
               </w:rPr>
-              <w:t>Loob KAVAND treeningukorra. Kontrollib juhataja rolli, aktiivset treeninguliiki, treeneri rolli ja pädevust, ruumi aktiivsust, ajavahemikku, mahutavust ning treeneri/ruumi kattuvusi.</w:t>
+              <w:t>Kasutus kasutusjuhtude poolt: Planeeri treeningukord. Eeltingimused: aktiivne treeninguliik, aktiivne ruum ja TREENER rolliga pädev treener. Järeltingimused: tekib KAVAND treeningukord. Tõrkeolukorrad: vale roll, kattuv aeg, ruumi mahu ületamine või pädevuse puudumine.</w:t>
             </w:r>
           </w:p>
         </w:tc>
@@ -2684,7 +4157,7 @@
                 <w:b w:val="0"/>
                 <w:sz w:val="18"/>
               </w:rPr>
-              <w:t>Muudab tulevase KAVAND treeningukorra seisundisse AVATUD. Ebaõnnestub, kui kirje puudub, pole kavandatud või algus on möödas.</w:t>
+              <w:t>Kasutus kasutusjuhtude poolt: Ava registreerimine. Eeltingimused: treeningukord on KAVAND ja tulevikus. Järeltingimused: seisund muutub AVATUD. Tõrkeolukorrad: kirje puudub, seisund pole KAVAND või algus on möödas.</w:t>
             </w:r>
           </w:p>
         </w:tc>
@@ -2734,7 +4207,7 @@
                 <w:b w:val="0"/>
                 <w:sz w:val="18"/>
               </w:rPr>
-              <w:t>Muudab AVATUD treeningukorra seisundisse SULETUD. Treener peab ootama registreerimise tähtaja möödumist; juhataja saab sulgeda vajadusel varem.</w:t>
+              <w:t>Kasutus kasutusjuhtude poolt: Sulge registreerimine. Eeltingimused: treeningukord on AVATUD ja tegutseja on juhataja või määratud treener. Järeltingimused: seisund muutub SULETUD. Tõrkeolukorrad: vale roll või liiga varane sulgemine treeneri poolt.</w:t>
             </w:r>
           </w:p>
         </w:tc>
@@ -2784,7 +4257,7 @@
                 <w:b w:val="0"/>
                 <w:sz w:val="18"/>
               </w:rPr>
-              <w:t>Muudab lõppenud SULETUD treeningukorra seisundisse TOIMUNUD. Ei luba tulevast treeningukorda lõpetada.</w:t>
+              <w:t>Kasutus kasutusjuhtude poolt: Lõpeta treeningukord. Eeltingimused: treeningukord on SULETUD ja lõpu aeg on möödas. Järeltingimused: seisund muutub TOIMUNUD. Tõrkeolukorrad: vale roll, vale seisund või tulevane treeningukord.</w:t>
             </w:r>
           </w:p>
         </w:tc>
@@ -2834,7 +4307,7 @@
                 <w:b w:val="0"/>
                 <w:sz w:val="18"/>
               </w:rPr>
-              <w:t>Loob registreeringu. Kontrollib aktiivset klienti, AVATUD seisundit, tähtaega ja topeltaktiivse registreeringu puudumist. Tagastab seisundi ja teate.</w:t>
+              <w:t>Kasutus kasutusjuhtude poolt: Registreeru treeningukorrale. Eeltingimused: aktiivne klient ja AVATUD treeningukord tähtaja sees. Järeltingimused: tekib KINNIT või OOTEJRK registreering. Tõrkeolukorrad: topeltaktiivne registreering, möödunud tähtaeg või mitteaktiivne klient.</w:t>
             </w:r>
           </w:p>
         </w:tc>
@@ -2884,7 +4357,7 @@
                 <w:b w:val="0"/>
                 <w:sz w:val="18"/>
               </w:rPr>
-              <w:t>Tühistab aktiivse registreeringu. Klient saab tühistada ainult enda registreeringu enne tähtaega. Kinnitatud koha vabanemisel kutsub edendamise funktsiooni.</w:t>
+              <w:t>Kasutus kasutusjuhtude poolt: Tühista registreering. Eeltingimused: aktiivne registreering; klient tegutseb enda nimel või tegutseja on juhataja. Järeltingimused: registreering muutub TYH_KL või TYH_SYS; kinnitatud koha vabanemisel edendatakse ootejärjekord. Tõrkeolukorrad: vale omanik, möödunud tähtaeg või lõpetatud treeningukord.</w:t>
             </w:r>
           </w:p>
         </w:tc>
@@ -2934,7 +4407,7 @@
                 <w:b w:val="0"/>
                 <w:sz w:val="18"/>
               </w:rPr>
-              <w:t>Lukustab treeningukorra ja esimese OOTEJRK rea ning muudab selle seisundisse KINNIT, kui vaba koht on olemas.</w:t>
+              <w:t>Kasutus kasutusjuhtude poolt: Ootejärjekorrast edendamine registreeringu tühistamise järel. Eeltingimused: AVATUD treeningukorral on vaba koht ja OOTEJRK rida. Järeltingimused: esimene ootel registreering muutub KINNIT. Tõrkeolukorrad: vaba kohta või ootel rida pole.</w:t>
             </w:r>
           </w:p>
         </w:tc>
@@ -2984,7 +4457,7 @@
                 <w:b w:val="0"/>
                 <w:sz w:val="18"/>
               </w:rPr>
-              <w:t>Lisab või uuendab osalemise tulemuse kinnitatud registreeringule. Kontrollid on osalemise triggeris.</w:t>
+              <w:t>Kasutus kasutusjuhtude poolt: Märgi osalemine. Eeltingimused: kinnitatud registreering, alanud SULETUD või TOIMUNUD treeningukord ning määratud treener või juhataja. Järeltingimused: osalemise rida lisatakse või uuendatakse. Tõrkeolukorrad: vale roll, vale seisund või liiga varane märkimine.</w:t>
             </w:r>
           </w:p>
         </w:tc>
@@ -3034,7 +4507,7 @@
                 <w:b w:val="0"/>
                 <w:sz w:val="18"/>
               </w:rPr>
-              <w:t>Muudab treeningukorra TYHIST seisundisse ja tühistab kõik aktiivsed registreeringud seisundisse TYH_SYS.</w:t>
+              <w:t>Kasutus kasutusjuhtude poolt: Tühista treeningukord. Eeltingimused: treeningukord on KAVAND, AVATUD või SULETUD. Järeltingimused: treeningukord muutub TYHIST ning aktiivsed registreeringud TYH_SYS. Tõrkeolukorrad: vale roll, puuduv kirje või juba toimunud treeningukord.</w:t>
             </w:r>
           </w:p>
         </w:tc>
@@ -3059,7 +4532,7 @@
         <w:rPr>
           <w:b/>
         </w:rPr>
-        <w:t>Tabel 7. Ärireeglite realiseerimine</w:t>
+        <w:t>Tabel 8. Ärireeglite realiseerimine</w:t>
       </w:r>
     </w:p>
     <w:tbl>
@@ -3515,7 +4988,7 @@
         <w:rPr>
           <w:b/>
         </w:rPr>
-        <w:t>Tabel 8. Olulisemad tabelid ja piirangud</w:t>
+        <w:t>Tabel 9. Olulisemad tabelid ja piirangud</w:t>
       </w:r>
     </w:p>
     <w:tbl>
@@ -4090,7 +5563,7 @@
         <w:rPr>
           <w:b/>
         </w:rPr>
-        <w:t>Tabel 9. Rakenduse ja aruandluse vaated</w:t>
+        <w:t>Tabel 10. Rakenduse ja aruandluse vaated</w:t>
       </w:r>
     </w:p>
     <w:tbl>

</xml_diff>

<commit_message>
Align Flask demo port and refresh deliverables
</commit_message>
<xml_diff>
--- a/Jousaali_infosusteemi_treeningute_funktsionaalne_allsusteem.docx
+++ b/Jousaali_infosusteemi_treeningute_funktsionaalne_allsusteem.docx
@@ -311,7 +311,7 @@
                 <w:b w:val="0"/>
                 <w:sz w:val="18"/>
               </w:rPr>
-              <w:t>24.05.2026</w:t>
+              <w:t>25.05.2026</w:t>
             </w:r>
           </w:p>
         </w:tc>
@@ -18623,6 +18623,22 @@
         <w:pStyle w:val="SqlCode"/>
       </w:pPr>
       <w:r>
+        <w:t>CREATE INDEX ix_treeninguliik_registreerija ON treeninguliik (registreerija_e_meil);</w:t>
+      </w:r>
+    </w:p>
+    <w:p>
+      <w:pPr>
+        <w:pStyle w:val="SqlCode"/>
+      </w:pPr>
+      <w:r>
+        <w:t>CREATE INDEX ix_treeninguliik_viimase_muutja ON treeninguliik (viimase_muutja_e_meil);</w:t>
+      </w:r>
+    </w:p>
+    <w:p>
+      <w:pPr>
+        <w:pStyle w:val="SqlCode"/>
+      </w:pPr>
+      <w:r>
         <w:t>CREATE INDEX ix_treeninguliigi_kategooria_kategooria ON treeninguliigi_kategooria_omamine (treeningu_kategooria_kood);</w:t>
       </w:r>
     </w:p>
@@ -18687,6 +18703,22 @@
         <w:pStyle w:val="SqlCode"/>
       </w:pPr>
       <w:r>
+        <w:t>CREATE INDEX ix_treeningukord_looja ON treeningukord (looja_e_meil);</w:t>
+      </w:r>
+    </w:p>
+    <w:p>
+      <w:pPr>
+        <w:pStyle w:val="SqlCode"/>
+      </w:pPr>
+      <w:r>
+        <w:t>CREATE INDEX ix_treeningukord_viimase_muutja ON treeningukord (viimase_muutja_e_meil);</w:t>
+      </w:r>
+    </w:p>
+    <w:p>
+      <w:pPr>
+        <w:pStyle w:val="SqlCode"/>
+      </w:pPr>
+      <w:r>
         <w:t>CREATE INDEX ix_registreering_treeningukord ON registreering (treeningukorra_kood);</w:t>
       </w:r>
     </w:p>
@@ -18710,6 +18742,14 @@
       <w:pPr>
         <w:pStyle w:val="SqlCode"/>
       </w:pPr>
+      <w:r>
+        <w:t>CREATE INDEX ix_osalemine_markija ON osalemine (markija_e_meil);</w:t>
+      </w:r>
+    </w:p>
+    <w:p>
+      <w:pPr>
+        <w:pStyle w:val="SqlCode"/>
+      </w:pPr>
       <w:r/>
     </w:p>
     <w:p>
@@ -21415,6 +21455,22 @@
         <w:pStyle w:val="SqlCode"/>
       </w:pPr>
       <w:r>
+        <w:t>SECURITY DEFINER</w:t>
+      </w:r>
+    </w:p>
+    <w:p>
+      <w:pPr>
+        <w:pStyle w:val="SqlCode"/>
+      </w:pPr>
+      <w:r>
+        <w:t>SET search_path = public, pg_temp</w:t>
+      </w:r>
+    </w:p>
+    <w:p>
+      <w:pPr>
+        <w:pStyle w:val="SqlCode"/>
+      </w:pPr>
+      <w:r>
         <w:t>AS $$</w:t>
       </w:r>
     </w:p>
@@ -21777,6 +21833,22 @@
         <w:pStyle w:val="SqlCode"/>
       </w:pPr>
       <w:r>
+        <w:t>SECURITY DEFINER</w:t>
+      </w:r>
+    </w:p>
+    <w:p>
+      <w:pPr>
+        <w:pStyle w:val="SqlCode"/>
+      </w:pPr>
+      <w:r>
+        <w:t>SET search_path = public, pg_temp</w:t>
+      </w:r>
+    </w:p>
+    <w:p>
+      <w:pPr>
+        <w:pStyle w:val="SqlCode"/>
+      </w:pPr>
+      <w:r>
         <w:t>AS $$</w:t>
       </w:r>
     </w:p>
@@ -22003,6 +22075,22 @@
         <w:pStyle w:val="SqlCode"/>
       </w:pPr>
       <w:r>
+        <w:t>SECURITY DEFINER</w:t>
+      </w:r>
+    </w:p>
+    <w:p>
+      <w:pPr>
+        <w:pStyle w:val="SqlCode"/>
+      </w:pPr>
+      <w:r>
+        <w:t>SET search_path = public, pg_temp</w:t>
+      </w:r>
+    </w:p>
+    <w:p>
+      <w:pPr>
+        <w:pStyle w:val="SqlCode"/>
+      </w:pPr>
+      <w:r>
         <w:t>AS $$</w:t>
       </w:r>
     </w:p>
@@ -22335,6 +22423,22 @@
         <w:pStyle w:val="SqlCode"/>
       </w:pPr>
       <w:r>
+        <w:t>SECURITY DEFINER</w:t>
+      </w:r>
+    </w:p>
+    <w:p>
+      <w:pPr>
+        <w:pStyle w:val="SqlCode"/>
+      </w:pPr>
+      <w:r>
+        <w:t>SET search_path = public, pg_temp</w:t>
+      </w:r>
+    </w:p>
+    <w:p>
+      <w:pPr>
+        <w:pStyle w:val="SqlCode"/>
+      </w:pPr>
+      <w:r>
         <w:t>AS $$</w:t>
       </w:r>
     </w:p>
@@ -22677,6 +22781,22 @@
         <w:pStyle w:val="SqlCode"/>
       </w:pPr>
       <w:r>
+        <w:t>SECURITY DEFINER</w:t>
+      </w:r>
+    </w:p>
+    <w:p>
+      <w:pPr>
+        <w:pStyle w:val="SqlCode"/>
+      </w:pPr>
+      <w:r>
+        <w:t>SET search_path = public, pg_temp</w:t>
+      </w:r>
+    </w:p>
+    <w:p>
+      <w:pPr>
+        <w:pStyle w:val="SqlCode"/>
+      </w:pPr>
+      <w:r>
         <w:t>AS $$</w:t>
       </w:r>
     </w:p>
@@ -23289,6 +23409,22 @@
         <w:pStyle w:val="SqlCode"/>
       </w:pPr>
       <w:r>
+        <w:t>SECURITY DEFINER</w:t>
+      </w:r>
+    </w:p>
+    <w:p>
+      <w:pPr>
+        <w:pStyle w:val="SqlCode"/>
+      </w:pPr>
+      <w:r>
+        <w:t>SET search_path = public, pg_temp</w:t>
+      </w:r>
+    </w:p>
+    <w:p>
+      <w:pPr>
+        <w:pStyle w:val="SqlCode"/>
+      </w:pPr>
+      <w:r>
         <w:t>AS $$</w:t>
       </w:r>
     </w:p>
@@ -23753,6 +23889,22 @@
         <w:pStyle w:val="SqlCode"/>
       </w:pPr>
       <w:r>
+        <w:t>SECURITY DEFINER</w:t>
+      </w:r>
+    </w:p>
+    <w:p>
+      <w:pPr>
+        <w:pStyle w:val="SqlCode"/>
+      </w:pPr>
+      <w:r>
+        <w:t>SET search_path = public, pg_temp</w:t>
+      </w:r>
+    </w:p>
+    <w:p>
+      <w:pPr>
+        <w:pStyle w:val="SqlCode"/>
+      </w:pPr>
+      <w:r>
         <w:t>AS $$</w:t>
       </w:r>
     </w:p>
@@ -24319,6 +24471,22 @@
         <w:pStyle w:val="SqlCode"/>
       </w:pPr>
       <w:r>
+        <w:t>SECURITY DEFINER</w:t>
+      </w:r>
+    </w:p>
+    <w:p>
+      <w:pPr>
+        <w:pStyle w:val="SqlCode"/>
+      </w:pPr>
+      <w:r>
+        <w:t>SET search_path = public, pg_temp</w:t>
+      </w:r>
+    </w:p>
+    <w:p>
+      <w:pPr>
+        <w:pStyle w:val="SqlCode"/>
+      </w:pPr>
+      <w:r>
         <w:t>AS $$</w:t>
       </w:r>
     </w:p>
@@ -24557,6 +24725,22 @@
         <w:pStyle w:val="SqlCode"/>
       </w:pPr>
       <w:r>
+        <w:t>SECURITY DEFINER</w:t>
+      </w:r>
+    </w:p>
+    <w:p>
+      <w:pPr>
+        <w:pStyle w:val="SqlCode"/>
+      </w:pPr>
+      <w:r>
+        <w:t>SET search_path = public, pg_temp</w:t>
+      </w:r>
+    </w:p>
+    <w:p>
+      <w:pPr>
+        <w:pStyle w:val="SqlCode"/>
+      </w:pPr>
+      <w:r>
         <w:t>AS $$</w:t>
       </w:r>
     </w:p>
@@ -27585,6 +27769,350 @@
         <w:pStyle w:val="SqlCode"/>
       </w:pPr>
       <w:r>
+        <w:t>-- Demo treeningukord rows use fixed IDs as stable seed identities. Avoid</w:t>
+      </w:r>
+    </w:p>
+    <w:p>
+      <w:pPr>
+        <w:pStyle w:val="SqlCode"/>
+      </w:pPr>
+      <w:r>
+        <w:t>-- attempting duplicate inserts because BEFORE INSERT overlap triggers fire</w:t>
+      </w:r>
+    </w:p>
+    <w:p>
+      <w:pPr>
+        <w:pStyle w:val="SqlCode"/>
+      </w:pPr>
+      <w:r>
+        <w:t>-- before ON CONFLICT can skip an existing row.</w:t>
+      </w:r>
+    </w:p>
+    <w:p>
+      <w:pPr>
+        <w:pStyle w:val="SqlCode"/>
+      </w:pPr>
+      <w:r>
+        <w:t>WITH seeded_treeningukorrad (</w:t>
+      </w:r>
+    </w:p>
+    <w:p>
+      <w:pPr>
+        <w:pStyle w:val="SqlCode"/>
+      </w:pPr>
+      <w:r>
+        <w:t xml:space="preserve">    treeningukorra_kood,</w:t>
+      </w:r>
+    </w:p>
+    <w:p>
+      <w:pPr>
+        <w:pStyle w:val="SqlCode"/>
+      </w:pPr>
+      <w:r>
+        <w:t xml:space="preserve">    treeninguliigi_kood,</w:t>
+      </w:r>
+    </w:p>
+    <w:p>
+      <w:pPr>
+        <w:pStyle w:val="SqlCode"/>
+      </w:pPr>
+      <w:r>
+        <w:t xml:space="preserve">    treener_e_meil,</w:t>
+      </w:r>
+    </w:p>
+    <w:p>
+      <w:pPr>
+        <w:pStyle w:val="SqlCode"/>
+      </w:pPr>
+      <w:r>
+        <w:t xml:space="preserve">    ruumi_kood,</w:t>
+      </w:r>
+    </w:p>
+    <w:p>
+      <w:pPr>
+        <w:pStyle w:val="SqlCode"/>
+      </w:pPr>
+      <w:r>
+        <w:t xml:space="preserve">    alguse_aeg,</w:t>
+      </w:r>
+    </w:p>
+    <w:p>
+      <w:pPr>
+        <w:pStyle w:val="SqlCode"/>
+      </w:pPr>
+      <w:r>
+        <w:t xml:space="preserve">    lopu_aeg,</w:t>
+      </w:r>
+    </w:p>
+    <w:p>
+      <w:pPr>
+        <w:pStyle w:val="SqlCode"/>
+      </w:pPr>
+      <w:r>
+        <w:t xml:space="preserve">    registreerimise_lopp,</w:t>
+      </w:r>
+    </w:p>
+    <w:p>
+      <w:pPr>
+        <w:pStyle w:val="SqlCode"/>
+      </w:pPr>
+      <w:r>
+        <w:t xml:space="preserve">    tyhistamise_lopp,</w:t>
+      </w:r>
+    </w:p>
+    <w:p>
+      <w:pPr>
+        <w:pStyle w:val="SqlCode"/>
+      </w:pPr>
+      <w:r>
+        <w:t xml:space="preserve">    maksimaalne_osalejate_arv,</w:t>
+      </w:r>
+    </w:p>
+    <w:p>
+      <w:pPr>
+        <w:pStyle w:val="SqlCode"/>
+      </w:pPr>
+      <w:r>
+        <w:t xml:space="preserve">    seisundi_kood,</w:t>
+      </w:r>
+    </w:p>
+    <w:p>
+      <w:pPr>
+        <w:pStyle w:val="SqlCode"/>
+      </w:pPr>
+      <w:r>
+        <w:t xml:space="preserve">    looja_e_meil,</w:t>
+      </w:r>
+    </w:p>
+    <w:p>
+      <w:pPr>
+        <w:pStyle w:val="SqlCode"/>
+      </w:pPr>
+      <w:r>
+        <w:t xml:space="preserve">    viimase_muutja_e_meil</w:t>
+      </w:r>
+    </w:p>
+    <w:p>
+      <w:pPr>
+        <w:pStyle w:val="SqlCode"/>
+      </w:pPr>
+      <w:r>
+        <w:t>) AS (</w:t>
+      </w:r>
+    </w:p>
+    <w:p>
+      <w:pPr>
+        <w:pStyle w:val="SqlCode"/>
+      </w:pPr>
+      <w:r>
+        <w:t xml:space="preserve">    VALUES</w:t>
+      </w:r>
+    </w:p>
+    <w:p>
+      <w:pPr>
+        <w:pStyle w:val="SqlCode"/>
+      </w:pPr>
+      <w:r>
+        <w:t xml:space="preserve">    (2000, 1002, 'treener2@jousaal.ee', 'SAAL_B',</w:t>
+      </w:r>
+    </w:p>
+    <w:p>
+      <w:pPr>
+        <w:pStyle w:val="SqlCode"/>
+      </w:pPr>
+      <w:r>
+        <w:t xml:space="preserve">        CURRENT_TIMESTAMP + INTERVAL '10 days',</w:t>
+      </w:r>
+    </w:p>
+    <w:p>
+      <w:pPr>
+        <w:pStyle w:val="SqlCode"/>
+      </w:pPr>
+      <w:r>
+        <w:t xml:space="preserve">        CURRENT_TIMESTAMP + INTERVAL '10 days 75 minutes',</w:t>
+      </w:r>
+    </w:p>
+    <w:p>
+      <w:pPr>
+        <w:pStyle w:val="SqlCode"/>
+      </w:pPr>
+      <w:r>
+        <w:t xml:space="preserve">        CURRENT_TIMESTAMP + INTERVAL '9 days',</w:t>
+      </w:r>
+    </w:p>
+    <w:p>
+      <w:pPr>
+        <w:pStyle w:val="SqlCode"/>
+      </w:pPr>
+      <w:r>
+        <w:t xml:space="preserve">        CURRENT_TIMESTAMP + INTERVAL '9 days',</w:t>
+      </w:r>
+    </w:p>
+    <w:p>
+      <w:pPr>
+        <w:pStyle w:val="SqlCode"/>
+      </w:pPr>
+      <w:r>
+        <w:t xml:space="preserve">        8, 'KAVAND', 'juhataja@jousaal.ee', 'juhataja@jousaal.ee'),</w:t>
+      </w:r>
+    </w:p>
+    <w:p>
+      <w:pPr>
+        <w:pStyle w:val="SqlCode"/>
+      </w:pPr>
+      <w:r>
+        <w:t xml:space="preserve">    (2001, 1000, 'treener@jousaal.ee', 'SAAL_B',</w:t>
+      </w:r>
+    </w:p>
+    <w:p>
+      <w:pPr>
+        <w:pStyle w:val="SqlCode"/>
+      </w:pPr>
+      <w:r>
+        <w:t xml:space="preserve">        CURRENT_TIMESTAMP + INTERVAL '7 days',</w:t>
+      </w:r>
+    </w:p>
+    <w:p>
+      <w:pPr>
+        <w:pStyle w:val="SqlCode"/>
+      </w:pPr>
+      <w:r>
+        <w:t xml:space="preserve">        CURRENT_TIMESTAMP + INTERVAL '7 days 60 minutes',</w:t>
+      </w:r>
+    </w:p>
+    <w:p>
+      <w:pPr>
+        <w:pStyle w:val="SqlCode"/>
+      </w:pPr>
+      <w:r>
+        <w:t xml:space="preserve">        CURRENT_TIMESTAMP + INTERVAL '6 days',</w:t>
+      </w:r>
+    </w:p>
+    <w:p>
+      <w:pPr>
+        <w:pStyle w:val="SqlCode"/>
+      </w:pPr>
+      <w:r>
+        <w:t xml:space="preserve">        CURRENT_TIMESTAMP + INTERVAL '6 days',</w:t>
+      </w:r>
+    </w:p>
+    <w:p>
+      <w:pPr>
+        <w:pStyle w:val="SqlCode"/>
+      </w:pPr>
+      <w:r>
+        <w:t xml:space="preserve">        8, 'KAVAND', 'juhataja@jousaal.ee', 'juhataja@jousaal.ee'),</w:t>
+      </w:r>
+    </w:p>
+    <w:p>
+      <w:pPr>
+        <w:pStyle w:val="SqlCode"/>
+      </w:pPr>
+      <w:r>
+        <w:t xml:space="preserve">    (2002, 1001, 'treener@jousaal.ee', 'SAAL_A',</w:t>
+      </w:r>
+    </w:p>
+    <w:p>
+      <w:pPr>
+        <w:pStyle w:val="SqlCode"/>
+      </w:pPr>
+      <w:r>
+        <w:t xml:space="preserve">        CURRENT_TIMESTAMP + INTERVAL '5 days',</w:t>
+      </w:r>
+    </w:p>
+    <w:p>
+      <w:pPr>
+        <w:pStyle w:val="SqlCode"/>
+      </w:pPr>
+      <w:r>
+        <w:t xml:space="preserve">        CURRENT_TIMESTAMP + INTERVAL '5 days 45 minutes',</w:t>
+      </w:r>
+    </w:p>
+    <w:p>
+      <w:pPr>
+        <w:pStyle w:val="SqlCode"/>
+      </w:pPr>
+      <w:r>
+        <w:t xml:space="preserve">        CURRENT_TIMESTAMP + INTERVAL '4 days',</w:t>
+      </w:r>
+    </w:p>
+    <w:p>
+      <w:pPr>
+        <w:pStyle w:val="SqlCode"/>
+      </w:pPr>
+      <w:r>
+        <w:t xml:space="preserve">        CURRENT_TIMESTAMP + INTERVAL '4 days',</w:t>
+      </w:r>
+    </w:p>
+    <w:p>
+      <w:pPr>
+        <w:pStyle w:val="SqlCode"/>
+      </w:pPr>
+      <w:r>
+        <w:t xml:space="preserve">        2, 'KAVAND', 'juhataja@jousaal.ee', 'juhataja@jousaal.ee'),</w:t>
+      </w:r>
+    </w:p>
+    <w:p>
+      <w:pPr>
+        <w:pStyle w:val="SqlCode"/>
+      </w:pPr>
+      <w:r>
+        <w:t xml:space="preserve">    (2003, 1000, 'treener@jousaal.ee', 'SAAL_B',</w:t>
+      </w:r>
+    </w:p>
+    <w:p>
+      <w:pPr>
+        <w:pStyle w:val="SqlCode"/>
+      </w:pPr>
+      <w:r>
+        <w:t xml:space="preserve">        CURRENT_TIMESTAMP - INTERVAL '3 days',</w:t>
+      </w:r>
+    </w:p>
+    <w:p>
+      <w:pPr>
+        <w:pStyle w:val="SqlCode"/>
+      </w:pPr>
+      <w:r>
+        <w:t xml:space="preserve">        CURRENT_TIMESTAMP - INTERVAL '3 days' + INTERVAL '60 minutes',</w:t>
+      </w:r>
+    </w:p>
+    <w:p>
+      <w:pPr>
+        <w:pStyle w:val="SqlCode"/>
+      </w:pPr>
+      <w:r>
+        <w:t xml:space="preserve">        CURRENT_TIMESTAMP - INTERVAL '4 days',</w:t>
+      </w:r>
+    </w:p>
+    <w:p>
+      <w:pPr>
+        <w:pStyle w:val="SqlCode"/>
+      </w:pPr>
+      <w:r>
+        <w:t xml:space="preserve">        CURRENT_TIMESTAMP - INTERVAL '4 days',</w:t>
+      </w:r>
+    </w:p>
+    <w:p>
+      <w:pPr>
+        <w:pStyle w:val="SqlCode"/>
+      </w:pPr>
+      <w:r>
+        <w:t xml:space="preserve">        8, 'KAVAND', 'juhataja@jousaal.ee', 'juhataja@jousaal.ee')</w:t>
+      </w:r>
+    </w:p>
+    <w:p>
+      <w:pPr>
+        <w:pStyle w:val="SqlCode"/>
+      </w:pPr>
+      <w:r>
+        <w:t>)</w:t>
+      </w:r>
+    </w:p>
+    <w:p>
+      <w:pPr>
+        <w:pStyle w:val="SqlCode"/>
+      </w:pPr>
+      <w:r>
         <w:t>INSERT INTO treeningukord (</w:t>
       </w:r>
     </w:p>
@@ -27697,6 +28225,418 @@
         <w:pStyle w:val="SqlCode"/>
       </w:pPr>
       <w:r>
+        <w:t>SELECT</w:t>
+      </w:r>
+    </w:p>
+    <w:p>
+      <w:pPr>
+        <w:pStyle w:val="SqlCode"/>
+      </w:pPr>
+      <w:r>
+        <w:t xml:space="preserve">    s.treeningukorra_kood,</w:t>
+      </w:r>
+    </w:p>
+    <w:p>
+      <w:pPr>
+        <w:pStyle w:val="SqlCode"/>
+      </w:pPr>
+      <w:r>
+        <w:t xml:space="preserve">    s.treeninguliigi_kood,</w:t>
+      </w:r>
+    </w:p>
+    <w:p>
+      <w:pPr>
+        <w:pStyle w:val="SqlCode"/>
+      </w:pPr>
+      <w:r>
+        <w:t xml:space="preserve">    s.treener_e_meil,</w:t>
+      </w:r>
+    </w:p>
+    <w:p>
+      <w:pPr>
+        <w:pStyle w:val="SqlCode"/>
+      </w:pPr>
+      <w:r>
+        <w:t xml:space="preserve">    s.ruumi_kood,</w:t>
+      </w:r>
+    </w:p>
+    <w:p>
+      <w:pPr>
+        <w:pStyle w:val="SqlCode"/>
+      </w:pPr>
+      <w:r>
+        <w:t xml:space="preserve">    s.alguse_aeg,</w:t>
+      </w:r>
+    </w:p>
+    <w:p>
+      <w:pPr>
+        <w:pStyle w:val="SqlCode"/>
+      </w:pPr>
+      <w:r>
+        <w:t xml:space="preserve">    s.lopu_aeg,</w:t>
+      </w:r>
+    </w:p>
+    <w:p>
+      <w:pPr>
+        <w:pStyle w:val="SqlCode"/>
+      </w:pPr>
+      <w:r>
+        <w:t xml:space="preserve">    s.registreerimise_lopp,</w:t>
+      </w:r>
+    </w:p>
+    <w:p>
+      <w:pPr>
+        <w:pStyle w:val="SqlCode"/>
+      </w:pPr>
+      <w:r>
+        <w:t xml:space="preserve">    s.tyhistamise_lopp,</w:t>
+      </w:r>
+    </w:p>
+    <w:p>
+      <w:pPr>
+        <w:pStyle w:val="SqlCode"/>
+      </w:pPr>
+      <w:r>
+        <w:t xml:space="preserve">    s.maksimaalne_osalejate_arv,</w:t>
+      </w:r>
+    </w:p>
+    <w:p>
+      <w:pPr>
+        <w:pStyle w:val="SqlCode"/>
+      </w:pPr>
+      <w:r>
+        <w:t xml:space="preserve">    s.seisundi_kood,</w:t>
+      </w:r>
+    </w:p>
+    <w:p>
+      <w:pPr>
+        <w:pStyle w:val="SqlCode"/>
+      </w:pPr>
+      <w:r>
+        <w:t xml:space="preserve">    s.looja_e_meil,</w:t>
+      </w:r>
+    </w:p>
+    <w:p>
+      <w:pPr>
+        <w:pStyle w:val="SqlCode"/>
+      </w:pPr>
+      <w:r>
+        <w:t xml:space="preserve">    s.viimase_muutja_e_meil</w:t>
+      </w:r>
+    </w:p>
+    <w:p>
+      <w:pPr>
+        <w:pStyle w:val="SqlCode"/>
+      </w:pPr>
+      <w:r>
+        <w:t>FROM seeded_treeningukorrad s</w:t>
+      </w:r>
+    </w:p>
+    <w:p>
+      <w:pPr>
+        <w:pStyle w:val="SqlCode"/>
+      </w:pPr>
+      <w:r>
+        <w:t>WHERE NOT EXISTS (</w:t>
+      </w:r>
+    </w:p>
+    <w:p>
+      <w:pPr>
+        <w:pStyle w:val="SqlCode"/>
+      </w:pPr>
+      <w:r>
+        <w:t xml:space="preserve">    SELECT 1</w:t>
+      </w:r>
+    </w:p>
+    <w:p>
+      <w:pPr>
+        <w:pStyle w:val="SqlCode"/>
+      </w:pPr>
+      <w:r>
+        <w:t xml:space="preserve">    FROM treeningukord tk</w:t>
+      </w:r>
+    </w:p>
+    <w:p>
+      <w:pPr>
+        <w:pStyle w:val="SqlCode"/>
+      </w:pPr>
+      <w:r>
+        <w:t xml:space="preserve">    WHERE tk.treeningukorra_kood = s.treeningukorra_kood</w:t>
+      </w:r>
+    </w:p>
+    <w:p>
+      <w:pPr>
+        <w:pStyle w:val="SqlCode"/>
+      </w:pPr>
+      <w:r>
+        <w:t>);</w:t>
+      </w:r>
+    </w:p>
+    <w:p>
+      <w:pPr>
+        <w:pStyle w:val="SqlCode"/>
+      </w:pPr>
+      <w:r/>
+    </w:p>
+    <w:p>
+      <w:pPr>
+        <w:pStyle w:val="SqlCode"/>
+      </w:pPr>
+      <w:r>
+        <w:t>SELECT setval('seq_treeningukorra_kood', GREATEST((SELECT COALESCE(MAX(treeningukorra_kood), 1999) FROM treeningukord), 1999), TRUE);</w:t>
+      </w:r>
+    </w:p>
+    <w:p>
+      <w:pPr>
+        <w:pStyle w:val="SqlCode"/>
+      </w:pPr>
+      <w:r/>
+    </w:p>
+    <w:p>
+      <w:pPr>
+        <w:pStyle w:val="SqlCode"/>
+      </w:pPr>
+      <w:r>
+        <w:t>UPDATE treeningukord</w:t>
+      </w:r>
+    </w:p>
+    <w:p>
+      <w:pPr>
+        <w:pStyle w:val="SqlCode"/>
+      </w:pPr>
+      <w:r>
+        <w:t>SET seisundi_kood = 'AVATUD',</w:t>
+      </w:r>
+    </w:p>
+    <w:p>
+      <w:pPr>
+        <w:pStyle w:val="SqlCode"/>
+      </w:pPr>
+      <w:r>
+        <w:t xml:space="preserve">    viimase_muutmise_aeg = CURRENT_TIMESTAMP</w:t>
+      </w:r>
+    </w:p>
+    <w:p>
+      <w:pPr>
+        <w:pStyle w:val="SqlCode"/>
+      </w:pPr>
+      <w:r>
+        <w:t>WHERE treeningukorra_kood IN (2001, 2002)</w:t>
+      </w:r>
+    </w:p>
+    <w:p>
+      <w:pPr>
+        <w:pStyle w:val="SqlCode"/>
+      </w:pPr>
+      <w:r>
+        <w:t xml:space="preserve">  AND seisundi_kood = 'KAVAND';</w:t>
+      </w:r>
+    </w:p>
+    <w:p>
+      <w:pPr>
+        <w:pStyle w:val="SqlCode"/>
+      </w:pPr>
+      <w:r/>
+    </w:p>
+    <w:p>
+      <w:pPr>
+        <w:pStyle w:val="SqlCode"/>
+      </w:pPr>
+      <w:r>
+        <w:t>UPDATE treeningukord</w:t>
+      </w:r>
+    </w:p>
+    <w:p>
+      <w:pPr>
+        <w:pStyle w:val="SqlCode"/>
+      </w:pPr>
+      <w:r>
+        <w:t>SET seisundi_kood = 'AVATUD',</w:t>
+      </w:r>
+    </w:p>
+    <w:p>
+      <w:pPr>
+        <w:pStyle w:val="SqlCode"/>
+      </w:pPr>
+      <w:r>
+        <w:t xml:space="preserve">    viimase_muutmise_aeg = CURRENT_TIMESTAMP</w:t>
+      </w:r>
+    </w:p>
+    <w:p>
+      <w:pPr>
+        <w:pStyle w:val="SqlCode"/>
+      </w:pPr>
+      <w:r>
+        <w:t>WHERE treeningukorra_kood = 2003</w:t>
+      </w:r>
+    </w:p>
+    <w:p>
+      <w:pPr>
+        <w:pStyle w:val="SqlCode"/>
+      </w:pPr>
+      <w:r>
+        <w:t xml:space="preserve">  AND seisundi_kood = 'KAVAND';</w:t>
+      </w:r>
+    </w:p>
+    <w:p>
+      <w:pPr>
+        <w:pStyle w:val="SqlCode"/>
+      </w:pPr>
+      <w:r/>
+    </w:p>
+    <w:p>
+      <w:pPr>
+        <w:pStyle w:val="SqlCode"/>
+      </w:pPr>
+      <w:r>
+        <w:t>UPDATE treeningukord</w:t>
+      </w:r>
+    </w:p>
+    <w:p>
+      <w:pPr>
+        <w:pStyle w:val="SqlCode"/>
+      </w:pPr>
+      <w:r>
+        <w:t>SET seisundi_kood = 'SULETUD',</w:t>
+      </w:r>
+    </w:p>
+    <w:p>
+      <w:pPr>
+        <w:pStyle w:val="SqlCode"/>
+      </w:pPr>
+      <w:r>
+        <w:t xml:space="preserve">    viimase_muutmise_aeg = CURRENT_TIMESTAMP</w:t>
+      </w:r>
+    </w:p>
+    <w:p>
+      <w:pPr>
+        <w:pStyle w:val="SqlCode"/>
+      </w:pPr>
+      <w:r>
+        <w:t>WHERE treeningukorra_kood = 2003</w:t>
+      </w:r>
+    </w:p>
+    <w:p>
+      <w:pPr>
+        <w:pStyle w:val="SqlCode"/>
+      </w:pPr>
+      <w:r>
+        <w:t xml:space="preserve">  AND seisundi_kood = 'AVATUD';</w:t>
+      </w:r>
+    </w:p>
+    <w:p>
+      <w:pPr>
+        <w:pStyle w:val="SqlCode"/>
+      </w:pPr>
+      <w:r/>
+    </w:p>
+    <w:p>
+      <w:pPr>
+        <w:pStyle w:val="SqlCode"/>
+      </w:pPr>
+      <w:r>
+        <w:t>UPDATE treeningukord</w:t>
+      </w:r>
+    </w:p>
+    <w:p>
+      <w:pPr>
+        <w:pStyle w:val="SqlCode"/>
+      </w:pPr>
+      <w:r>
+        <w:t>SET seisundi_kood = 'TOIMUNUD',</w:t>
+      </w:r>
+    </w:p>
+    <w:p>
+      <w:pPr>
+        <w:pStyle w:val="SqlCode"/>
+      </w:pPr>
+      <w:r>
+        <w:t xml:space="preserve">    viimase_muutmise_aeg = CURRENT_TIMESTAMP</w:t>
+      </w:r>
+    </w:p>
+    <w:p>
+      <w:pPr>
+        <w:pStyle w:val="SqlCode"/>
+      </w:pPr>
+      <w:r>
+        <w:t>WHERE treeningukorra_kood = 2003</w:t>
+      </w:r>
+    </w:p>
+    <w:p>
+      <w:pPr>
+        <w:pStyle w:val="SqlCode"/>
+      </w:pPr>
+      <w:r>
+        <w:t xml:space="preserve">  AND seisundi_kood = 'SULETUD';</w:t>
+      </w:r>
+    </w:p>
+    <w:p>
+      <w:pPr>
+        <w:pStyle w:val="SqlCode"/>
+      </w:pPr>
+      <w:r/>
+    </w:p>
+    <w:p>
+      <w:pPr>
+        <w:pStyle w:val="SqlCode"/>
+      </w:pPr>
+      <w:r>
+        <w:t>INSERT INTO registreering (</w:t>
+      </w:r>
+    </w:p>
+    <w:p>
+      <w:pPr>
+        <w:pStyle w:val="SqlCode"/>
+      </w:pPr>
+      <w:r>
+        <w:t xml:space="preserve">    registreeringu_kood,</w:t>
+      </w:r>
+    </w:p>
+    <w:p>
+      <w:pPr>
+        <w:pStyle w:val="SqlCode"/>
+      </w:pPr>
+      <w:r>
+        <w:t xml:space="preserve">    treeningukorra_kood,</w:t>
+      </w:r>
+    </w:p>
+    <w:p>
+      <w:pPr>
+        <w:pStyle w:val="SqlCode"/>
+      </w:pPr>
+      <w:r>
+        <w:t xml:space="preserve">    klient_e_meil,</w:t>
+      </w:r>
+    </w:p>
+    <w:p>
+      <w:pPr>
+        <w:pStyle w:val="SqlCode"/>
+      </w:pPr>
+      <w:r>
+        <w:t xml:space="preserve">    seisundi_kood,</w:t>
+      </w:r>
+    </w:p>
+    <w:p>
+      <w:pPr>
+        <w:pStyle w:val="SqlCode"/>
+      </w:pPr>
+      <w:r>
+        <w:t xml:space="preserve">    ootejarjekorra_nr</w:t>
+      </w:r>
+    </w:p>
+    <w:p>
+      <w:pPr>
+        <w:pStyle w:val="SqlCode"/>
+      </w:pPr>
+      <w:r>
+        <w:t>)</w:t>
+      </w:r>
+    </w:p>
+    <w:p>
+      <w:pPr>
+        <w:pStyle w:val="SqlCode"/>
+      </w:pPr>
+      <w:r>
         <w:t>VALUES</w:t>
       </w:r>
     </w:p>
@@ -27705,191 +28645,39 @@
         <w:pStyle w:val="SqlCode"/>
       </w:pPr>
       <w:r>
-        <w:t>(2000, 1002, 'treener2@jousaal.ee', 'SAAL_B',</w:t>
-      </w:r>
-    </w:p>
-    <w:p>
-      <w:pPr>
-        <w:pStyle w:val="SqlCode"/>
-      </w:pPr>
-      <w:r>
-        <w:t xml:space="preserve">    CURRENT_TIMESTAMP + INTERVAL '10 days',</w:t>
-      </w:r>
-    </w:p>
-    <w:p>
-      <w:pPr>
-        <w:pStyle w:val="SqlCode"/>
-      </w:pPr>
-      <w:r>
-        <w:t xml:space="preserve">    CURRENT_TIMESTAMP + INTERVAL '10 days 75 minutes',</w:t>
-      </w:r>
-    </w:p>
-    <w:p>
-      <w:pPr>
-        <w:pStyle w:val="SqlCode"/>
-      </w:pPr>
-      <w:r>
-        <w:t xml:space="preserve">    CURRENT_TIMESTAMP + INTERVAL '9 days',</w:t>
-      </w:r>
-    </w:p>
-    <w:p>
-      <w:pPr>
-        <w:pStyle w:val="SqlCode"/>
-      </w:pPr>
-      <w:r>
-        <w:t xml:space="preserve">    CURRENT_TIMESTAMP + INTERVAL '9 days',</w:t>
-      </w:r>
-    </w:p>
-    <w:p>
-      <w:pPr>
-        <w:pStyle w:val="SqlCode"/>
-      </w:pPr>
-      <w:r>
-        <w:t xml:space="preserve">    8, 'KAVAND', 'juhataja@jousaal.ee', 'juhataja@jousaal.ee'),</w:t>
-      </w:r>
-    </w:p>
-    <w:p>
-      <w:pPr>
-        <w:pStyle w:val="SqlCode"/>
-      </w:pPr>
-      <w:r>
-        <w:t>(2001, 1000, 'treener@jousaal.ee', 'SAAL_B',</w:t>
-      </w:r>
-    </w:p>
-    <w:p>
-      <w:pPr>
-        <w:pStyle w:val="SqlCode"/>
-      </w:pPr>
-      <w:r>
-        <w:t xml:space="preserve">    CURRENT_TIMESTAMP + INTERVAL '7 days',</w:t>
-      </w:r>
-    </w:p>
-    <w:p>
-      <w:pPr>
-        <w:pStyle w:val="SqlCode"/>
-      </w:pPr>
-      <w:r>
-        <w:t xml:space="preserve">    CURRENT_TIMESTAMP + INTERVAL '7 days 60 minutes',</w:t>
-      </w:r>
-    </w:p>
-    <w:p>
-      <w:pPr>
-        <w:pStyle w:val="SqlCode"/>
-      </w:pPr>
-      <w:r>
-        <w:t xml:space="preserve">    CURRENT_TIMESTAMP + INTERVAL '6 days',</w:t>
-      </w:r>
-    </w:p>
-    <w:p>
-      <w:pPr>
-        <w:pStyle w:val="SqlCode"/>
-      </w:pPr>
-      <w:r>
-        <w:t xml:space="preserve">    CURRENT_TIMESTAMP + INTERVAL '6 days',</w:t>
-      </w:r>
-    </w:p>
-    <w:p>
-      <w:pPr>
-        <w:pStyle w:val="SqlCode"/>
-      </w:pPr>
-      <w:r>
-        <w:t xml:space="preserve">    8, 'KAVAND', 'juhataja@jousaal.ee', 'juhataja@jousaal.ee'),</w:t>
-      </w:r>
-    </w:p>
-    <w:p>
-      <w:pPr>
-        <w:pStyle w:val="SqlCode"/>
-      </w:pPr>
-      <w:r>
-        <w:t>(2002, 1001, 'treener@jousaal.ee', 'SAAL_A',</w:t>
-      </w:r>
-    </w:p>
-    <w:p>
-      <w:pPr>
-        <w:pStyle w:val="SqlCode"/>
-      </w:pPr>
-      <w:r>
-        <w:t xml:space="preserve">    CURRENT_TIMESTAMP + INTERVAL '5 days',</w:t>
-      </w:r>
-    </w:p>
-    <w:p>
-      <w:pPr>
-        <w:pStyle w:val="SqlCode"/>
-      </w:pPr>
-      <w:r>
-        <w:t xml:space="preserve">    CURRENT_TIMESTAMP + INTERVAL '5 days 45 minutes',</w:t>
-      </w:r>
-    </w:p>
-    <w:p>
-      <w:pPr>
-        <w:pStyle w:val="SqlCode"/>
-      </w:pPr>
-      <w:r>
-        <w:t xml:space="preserve">    CURRENT_TIMESTAMP + INTERVAL '4 days',</w:t>
-      </w:r>
-    </w:p>
-    <w:p>
-      <w:pPr>
-        <w:pStyle w:val="SqlCode"/>
-      </w:pPr>
-      <w:r>
-        <w:t xml:space="preserve">    CURRENT_TIMESTAMP + INTERVAL '4 days',</w:t>
-      </w:r>
-    </w:p>
-    <w:p>
-      <w:pPr>
-        <w:pStyle w:val="SqlCode"/>
-      </w:pPr>
-      <w:r>
-        <w:t xml:space="preserve">    2, 'KAVAND', 'juhataja@jousaal.ee', 'juhataja@jousaal.ee'),</w:t>
-      </w:r>
-    </w:p>
-    <w:p>
-      <w:pPr>
-        <w:pStyle w:val="SqlCode"/>
-      </w:pPr>
-      <w:r>
-        <w:t>(2003, 1000, 'treener@jousaal.ee', 'SAAL_B',</w:t>
-      </w:r>
-    </w:p>
-    <w:p>
-      <w:pPr>
-        <w:pStyle w:val="SqlCode"/>
-      </w:pPr>
-      <w:r>
-        <w:t xml:space="preserve">    CURRENT_TIMESTAMP - INTERVAL '3 days',</w:t>
-      </w:r>
-    </w:p>
-    <w:p>
-      <w:pPr>
-        <w:pStyle w:val="SqlCode"/>
-      </w:pPr>
-      <w:r>
-        <w:t xml:space="preserve">    CURRENT_TIMESTAMP - INTERVAL '3 days' + INTERVAL '60 minutes',</w:t>
-      </w:r>
-    </w:p>
-    <w:p>
-      <w:pPr>
-        <w:pStyle w:val="SqlCode"/>
-      </w:pPr>
-      <w:r>
-        <w:t xml:space="preserve">    CURRENT_TIMESTAMP - INTERVAL '4 days',</w:t>
-      </w:r>
-    </w:p>
-    <w:p>
-      <w:pPr>
-        <w:pStyle w:val="SqlCode"/>
-      </w:pPr>
-      <w:r>
-        <w:t xml:space="preserve">    CURRENT_TIMESTAMP - INTERVAL '4 days',</w:t>
-      </w:r>
-    </w:p>
-    <w:p>
-      <w:pPr>
-        <w:pStyle w:val="SqlCode"/>
-      </w:pPr>
-      <w:r>
-        <w:t xml:space="preserve">    8, 'KAVAND', 'juhataja@jousaal.ee', 'juhataja@jousaal.ee')</w:t>
+        <w:t>(3000, 2002, 'klient@jousaal.ee', 'KINNIT', NULL),</w:t>
+      </w:r>
+    </w:p>
+    <w:p>
+      <w:pPr>
+        <w:pStyle w:val="SqlCode"/>
+      </w:pPr>
+      <w:r>
+        <w:t>(3001, 2002, 'klient2@jousaal.ee', 'KINNIT', NULL),</w:t>
+      </w:r>
+    </w:p>
+    <w:p>
+      <w:pPr>
+        <w:pStyle w:val="SqlCode"/>
+      </w:pPr>
+      <w:r>
+        <w:t>(3002, 2002, 'klient3@jousaal.ee', 'OOTEJRK', 1),</w:t>
+      </w:r>
+    </w:p>
+    <w:p>
+      <w:pPr>
+        <w:pStyle w:val="SqlCode"/>
+      </w:pPr>
+      <w:r>
+        <w:t>(3003, 2003, 'klient@jousaal.ee', 'KINNIT', NULL),</w:t>
+      </w:r>
+    </w:p>
+    <w:p>
+      <w:pPr>
+        <w:pStyle w:val="SqlCode"/>
+      </w:pPr>
+      <w:r>
+        <w:t>(3004, 2003, 'klient2@jousaal.ee', 'KINNIT', NULL)</w:t>
       </w:r>
     </w:p>
     <w:p>
@@ -27911,7 +28699,7 @@
         <w:pStyle w:val="SqlCode"/>
       </w:pPr>
       <w:r>
-        <w:t>SELECT setval('seq_treeningukorra_kood', GREATEST((SELECT COALESCE(MAX(treeningukorra_kood), 1999) FROM treeningukord), 1999), TRUE);</w:t>
+        <w:t>SELECT setval('seq_registreeringu_kood', GREATEST((SELECT COALESCE(MAX(registreeringu_kood), 2999) FROM registreering), 2999), TRUE);</w:t>
       </w:r>
     </w:p>
     <w:p>
@@ -27925,39 +28713,39 @@
         <w:pStyle w:val="SqlCode"/>
       </w:pPr>
       <w:r>
-        <w:t>UPDATE treeningukord</w:t>
-      </w:r>
-    </w:p>
-    <w:p>
-      <w:pPr>
-        <w:pStyle w:val="SqlCode"/>
-      </w:pPr>
-      <w:r>
-        <w:t>SET seisundi_kood = 'AVATUD',</w:t>
-      </w:r>
-    </w:p>
-    <w:p>
-      <w:pPr>
-        <w:pStyle w:val="SqlCode"/>
-      </w:pPr>
-      <w:r>
-        <w:t xml:space="preserve">    viimase_muutmise_aeg = CURRENT_TIMESTAMP</w:t>
-      </w:r>
-    </w:p>
-    <w:p>
-      <w:pPr>
-        <w:pStyle w:val="SqlCode"/>
-      </w:pPr>
-      <w:r>
-        <w:t>WHERE treeningukorra_kood IN (2001, 2002)</w:t>
-      </w:r>
-    </w:p>
-    <w:p>
-      <w:pPr>
-        <w:pStyle w:val="SqlCode"/>
-      </w:pPr>
-      <w:r>
-        <w:t xml:space="preserve">  AND seisundi_kood = 'KAVAND';</w:t>
+        <w:t>INSERT INTO osalemine (registreeringu_kood, osales, markija_e_meil, markus)</w:t>
+      </w:r>
+    </w:p>
+    <w:p>
+      <w:pPr>
+        <w:pStyle w:val="SqlCode"/>
+      </w:pPr>
+      <w:r>
+        <w:t>VALUES</w:t>
+      </w:r>
+    </w:p>
+    <w:p>
+      <w:pPr>
+        <w:pStyle w:val="SqlCode"/>
+      </w:pPr>
+      <w:r>
+        <w:t>(3003, TRUE, 'treener@jousaal.ee', 'Osales kogu treeningus.'),</w:t>
+      </w:r>
+    </w:p>
+    <w:p>
+      <w:pPr>
+        <w:pStyle w:val="SqlCode"/>
+      </w:pPr>
+      <w:r>
+        <w:t>(3004, FALSE, 'treener@jousaal.ee', 'Puudus ette teatamata.')</w:t>
+      </w:r>
+    </w:p>
+    <w:p>
+      <w:pPr>
+        <w:pStyle w:val="SqlCode"/>
+      </w:pPr>
+      <w:r>
+        <w:t>ON CONFLICT DO NOTHING;</w:t>
       </w:r>
     </w:p>
     <w:p>
@@ -27971,39 +28759,207 @@
         <w:pStyle w:val="SqlCode"/>
       </w:pPr>
       <w:r>
-        <w:t>UPDATE treeningukord</w:t>
-      </w:r>
-    </w:p>
-    <w:p>
-      <w:pPr>
-        <w:pStyle w:val="SqlCode"/>
-      </w:pPr>
-      <w:r>
-        <w:t>SET seisundi_kood = 'AVATUD',</w:t>
-      </w:r>
-    </w:p>
-    <w:p>
-      <w:pPr>
-        <w:pStyle w:val="SqlCode"/>
-      </w:pPr>
-      <w:r>
-        <w:t xml:space="preserve">    viimase_muutmise_aeg = CURRENT_TIMESTAMP</w:t>
-      </w:r>
-    </w:p>
-    <w:p>
-      <w:pPr>
-        <w:pStyle w:val="SqlCode"/>
-      </w:pPr>
-      <w:r>
-        <w:t>WHERE treeningukorra_kood = 2003</w:t>
-      </w:r>
-    </w:p>
-    <w:p>
-      <w:pPr>
-        <w:pStyle w:val="SqlCode"/>
-      </w:pPr>
-      <w:r>
-        <w:t xml:space="preserve">  AND seisundi_kood = 'KAVAND';</w:t>
+        <w:t>DO $$</w:t>
+      </w:r>
+    </w:p>
+    <w:p>
+      <w:pPr>
+        <w:pStyle w:val="SqlCode"/>
+      </w:pPr>
+      <w:r>
+        <w:t>DECLARE</w:t>
+      </w:r>
+    </w:p>
+    <w:p>
+      <w:pPr>
+        <w:pStyle w:val="SqlCode"/>
+      </w:pPr>
+      <w:r>
+        <w:t xml:space="preserve">    v_failed BOOLEAN;</w:t>
+      </w:r>
+    </w:p>
+    <w:p>
+      <w:pPr>
+        <w:pStyle w:val="SqlCode"/>
+      </w:pPr>
+      <w:r>
+        <w:t>BEGIN</w:t>
+      </w:r>
+    </w:p>
+    <w:p>
+      <w:pPr>
+        <w:pStyle w:val="SqlCode"/>
+      </w:pPr>
+      <w:r>
+        <w:t xml:space="preserve">    v_failed := FALSE;</w:t>
+      </w:r>
+    </w:p>
+    <w:p>
+      <w:pPr>
+        <w:pStyle w:val="SqlCode"/>
+      </w:pPr>
+      <w:r>
+        <w:t xml:space="preserve">    BEGIN</w:t>
+      </w:r>
+    </w:p>
+    <w:p>
+      <w:pPr>
+        <w:pStyle w:val="SqlCode"/>
+      </w:pPr>
+      <w:r>
+        <w:t xml:space="preserve">        INSERT INTO treeningukord (</w:t>
+      </w:r>
+    </w:p>
+    <w:p>
+      <w:pPr>
+        <w:pStyle w:val="SqlCode"/>
+      </w:pPr>
+      <w:r>
+        <w:t xml:space="preserve">            treeninguliigi_kood, treener_e_meil, ruumi_kood, alguse_aeg, lopu_aeg,</w:t>
+      </w:r>
+    </w:p>
+    <w:p>
+      <w:pPr>
+        <w:pStyle w:val="SqlCode"/>
+      </w:pPr>
+      <w:r>
+        <w:t xml:space="preserve">            registreerimise_lopp, tyhistamise_lopp, maksimaalne_osalejate_arv,</w:t>
+      </w:r>
+    </w:p>
+    <w:p>
+      <w:pPr>
+        <w:pStyle w:val="SqlCode"/>
+      </w:pPr>
+      <w:r>
+        <w:t xml:space="preserve">            seisundi_kood, looja_e_meil, viimase_muutja_e_meil</w:t>
+      </w:r>
+    </w:p>
+    <w:p>
+      <w:pPr>
+        <w:pStyle w:val="SqlCode"/>
+      </w:pPr>
+      <w:r>
+        <w:t xml:space="preserve">        )</w:t>
+      </w:r>
+    </w:p>
+    <w:p>
+      <w:pPr>
+        <w:pStyle w:val="SqlCode"/>
+      </w:pPr>
+      <w:r>
+        <w:t xml:space="preserve">        VALUES (</w:t>
+      </w:r>
+    </w:p>
+    <w:p>
+      <w:pPr>
+        <w:pStyle w:val="SqlCode"/>
+      </w:pPr>
+      <w:r>
+        <w:t xml:space="preserve">            1000, 'treener@jousaal.ee', 'SAAL_B',</w:t>
+      </w:r>
+    </w:p>
+    <w:p>
+      <w:pPr>
+        <w:pStyle w:val="SqlCode"/>
+      </w:pPr>
+      <w:r>
+        <w:t xml:space="preserve">            CURRENT_TIMESTAMP + INTERVAL '7 days 15 minutes',</w:t>
+      </w:r>
+    </w:p>
+    <w:p>
+      <w:pPr>
+        <w:pStyle w:val="SqlCode"/>
+      </w:pPr>
+      <w:r>
+        <w:t xml:space="preserve">            CURRENT_TIMESTAMP + INTERVAL '7 days 75 minutes',</w:t>
+      </w:r>
+    </w:p>
+    <w:p>
+      <w:pPr>
+        <w:pStyle w:val="SqlCode"/>
+      </w:pPr>
+      <w:r>
+        <w:t xml:space="preserve">            CURRENT_TIMESTAMP + INTERVAL '6 days',</w:t>
+      </w:r>
+    </w:p>
+    <w:p>
+      <w:pPr>
+        <w:pStyle w:val="SqlCode"/>
+      </w:pPr>
+      <w:r>
+        <w:t xml:space="preserve">            CURRENT_TIMESTAMP + INTERVAL '6 days',</w:t>
+      </w:r>
+    </w:p>
+    <w:p>
+      <w:pPr>
+        <w:pStyle w:val="SqlCode"/>
+      </w:pPr>
+      <w:r>
+        <w:t xml:space="preserve">            8, 'KAVAND', 'juhataja@jousaal.ee', 'juhataja@jousaal.ee'</w:t>
+      </w:r>
+    </w:p>
+    <w:p>
+      <w:pPr>
+        <w:pStyle w:val="SqlCode"/>
+      </w:pPr>
+      <w:r>
+        <w:t xml:space="preserve">        );</w:t>
+      </w:r>
+    </w:p>
+    <w:p>
+      <w:pPr>
+        <w:pStyle w:val="SqlCode"/>
+      </w:pPr>
+      <w:r>
+        <w:t xml:space="preserve">    EXCEPTION WHEN others THEN</w:t>
+      </w:r>
+    </w:p>
+    <w:p>
+      <w:pPr>
+        <w:pStyle w:val="SqlCode"/>
+      </w:pPr>
+      <w:r>
+        <w:t xml:space="preserve">        v_failed := TRUE;</w:t>
+      </w:r>
+    </w:p>
+    <w:p>
+      <w:pPr>
+        <w:pStyle w:val="SqlCode"/>
+      </w:pPr>
+      <w:r>
+        <w:t xml:space="preserve">        RAISE NOTICE 'Oodatud treeneri kattuvuse kontroll: %', SQLERRM;</w:t>
+      </w:r>
+    </w:p>
+    <w:p>
+      <w:pPr>
+        <w:pStyle w:val="SqlCode"/>
+      </w:pPr>
+      <w:r>
+        <w:t xml:space="preserve">    END;</w:t>
+      </w:r>
+    </w:p>
+    <w:p>
+      <w:pPr>
+        <w:pStyle w:val="SqlCode"/>
+      </w:pPr>
+      <w:r>
+        <w:t xml:space="preserve">    IF NOT v_failed THEN</w:t>
+      </w:r>
+    </w:p>
+    <w:p>
+      <w:pPr>
+        <w:pStyle w:val="SqlCode"/>
+      </w:pPr>
+      <w:r>
+        <w:t xml:space="preserve">        RAISE EXCEPTION 'Treeneri kattuvuse kontroll ei rakendunud.';</w:t>
+      </w:r>
+    </w:p>
+    <w:p>
+      <w:pPr>
+        <w:pStyle w:val="SqlCode"/>
+      </w:pPr>
+      <w:r>
+        <w:t xml:space="preserve">    END IF;</w:t>
       </w:r>
     </w:p>
     <w:p>
@@ -28017,39 +28973,175 @@
         <w:pStyle w:val="SqlCode"/>
       </w:pPr>
       <w:r>
-        <w:t>UPDATE treeningukord</w:t>
-      </w:r>
-    </w:p>
-    <w:p>
-      <w:pPr>
-        <w:pStyle w:val="SqlCode"/>
-      </w:pPr>
-      <w:r>
-        <w:t>SET seisundi_kood = 'SULETUD',</w:t>
-      </w:r>
-    </w:p>
-    <w:p>
-      <w:pPr>
-        <w:pStyle w:val="SqlCode"/>
-      </w:pPr>
-      <w:r>
-        <w:t xml:space="preserve">    viimase_muutmise_aeg = CURRENT_TIMESTAMP</w:t>
-      </w:r>
-    </w:p>
-    <w:p>
-      <w:pPr>
-        <w:pStyle w:val="SqlCode"/>
-      </w:pPr>
-      <w:r>
-        <w:t>WHERE treeningukorra_kood = 2003</w:t>
-      </w:r>
-    </w:p>
-    <w:p>
-      <w:pPr>
-        <w:pStyle w:val="SqlCode"/>
-      </w:pPr>
-      <w:r>
-        <w:t xml:space="preserve">  AND seisundi_kood = 'AVATUD';</w:t>
+        <w:t xml:space="preserve">    v_failed := FALSE;</w:t>
+      </w:r>
+    </w:p>
+    <w:p>
+      <w:pPr>
+        <w:pStyle w:val="SqlCode"/>
+      </w:pPr>
+      <w:r>
+        <w:t xml:space="preserve">    BEGIN</w:t>
+      </w:r>
+    </w:p>
+    <w:p>
+      <w:pPr>
+        <w:pStyle w:val="SqlCode"/>
+      </w:pPr>
+      <w:r>
+        <w:t xml:space="preserve">        INSERT INTO treeningukord (</w:t>
+      </w:r>
+    </w:p>
+    <w:p>
+      <w:pPr>
+        <w:pStyle w:val="SqlCode"/>
+      </w:pPr>
+      <w:r>
+        <w:t xml:space="preserve">            treeninguliigi_kood, treener_e_meil, ruumi_kood, alguse_aeg, lopu_aeg,</w:t>
+      </w:r>
+    </w:p>
+    <w:p>
+      <w:pPr>
+        <w:pStyle w:val="SqlCode"/>
+      </w:pPr>
+      <w:r>
+        <w:t xml:space="preserve">            registreerimise_lopp, tyhistamise_lopp, maksimaalne_osalejate_arv,</w:t>
+      </w:r>
+    </w:p>
+    <w:p>
+      <w:pPr>
+        <w:pStyle w:val="SqlCode"/>
+      </w:pPr>
+      <w:r>
+        <w:t xml:space="preserve">            seisundi_kood, looja_e_meil, viimase_muutja_e_meil</w:t>
+      </w:r>
+    </w:p>
+    <w:p>
+      <w:pPr>
+        <w:pStyle w:val="SqlCode"/>
+      </w:pPr>
+      <w:r>
+        <w:t xml:space="preserve">        )</w:t>
+      </w:r>
+    </w:p>
+    <w:p>
+      <w:pPr>
+        <w:pStyle w:val="SqlCode"/>
+      </w:pPr>
+      <w:r>
+        <w:t xml:space="preserve">        VALUES (</w:t>
+      </w:r>
+    </w:p>
+    <w:p>
+      <w:pPr>
+        <w:pStyle w:val="SqlCode"/>
+      </w:pPr>
+      <w:r>
+        <w:t xml:space="preserve">            1000, 'treener@jousaal.ee', 'SAAL_B',</w:t>
+      </w:r>
+    </w:p>
+    <w:p>
+      <w:pPr>
+        <w:pStyle w:val="SqlCode"/>
+      </w:pPr>
+      <w:r>
+        <w:t xml:space="preserve">            CURRENT_TIMESTAMP + INTERVAL '10 days 5 minutes',</w:t>
+      </w:r>
+    </w:p>
+    <w:p>
+      <w:pPr>
+        <w:pStyle w:val="SqlCode"/>
+      </w:pPr>
+      <w:r>
+        <w:t xml:space="preserve">            CURRENT_TIMESTAMP + INTERVAL '10 days 55 minutes',</w:t>
+      </w:r>
+    </w:p>
+    <w:p>
+      <w:pPr>
+        <w:pStyle w:val="SqlCode"/>
+      </w:pPr>
+      <w:r>
+        <w:t xml:space="preserve">            CURRENT_TIMESTAMP + INTERVAL '9 days',</w:t>
+      </w:r>
+    </w:p>
+    <w:p>
+      <w:pPr>
+        <w:pStyle w:val="SqlCode"/>
+      </w:pPr>
+      <w:r>
+        <w:t xml:space="preserve">            CURRENT_TIMESTAMP + INTERVAL '9 days',</w:t>
+      </w:r>
+    </w:p>
+    <w:p>
+      <w:pPr>
+        <w:pStyle w:val="SqlCode"/>
+      </w:pPr>
+      <w:r>
+        <w:t xml:space="preserve">            8, 'KAVAND', 'juhataja@jousaal.ee', 'juhataja@jousaal.ee'</w:t>
+      </w:r>
+    </w:p>
+    <w:p>
+      <w:pPr>
+        <w:pStyle w:val="SqlCode"/>
+      </w:pPr>
+      <w:r>
+        <w:t xml:space="preserve">        );</w:t>
+      </w:r>
+    </w:p>
+    <w:p>
+      <w:pPr>
+        <w:pStyle w:val="SqlCode"/>
+      </w:pPr>
+      <w:r>
+        <w:t xml:space="preserve">    EXCEPTION WHEN others THEN</w:t>
+      </w:r>
+    </w:p>
+    <w:p>
+      <w:pPr>
+        <w:pStyle w:val="SqlCode"/>
+      </w:pPr>
+      <w:r>
+        <w:t xml:space="preserve">        v_failed := TRUE;</w:t>
+      </w:r>
+    </w:p>
+    <w:p>
+      <w:pPr>
+        <w:pStyle w:val="SqlCode"/>
+      </w:pPr>
+      <w:r>
+        <w:t xml:space="preserve">        RAISE NOTICE 'Oodatud ruumi kattuvuse kontroll: %', SQLERRM;</w:t>
+      </w:r>
+    </w:p>
+    <w:p>
+      <w:pPr>
+        <w:pStyle w:val="SqlCode"/>
+      </w:pPr>
+      <w:r>
+        <w:t xml:space="preserve">    END;</w:t>
+      </w:r>
+    </w:p>
+    <w:p>
+      <w:pPr>
+        <w:pStyle w:val="SqlCode"/>
+      </w:pPr>
+      <w:r>
+        <w:t xml:space="preserve">    IF NOT v_failed THEN</w:t>
+      </w:r>
+    </w:p>
+    <w:p>
+      <w:pPr>
+        <w:pStyle w:val="SqlCode"/>
+      </w:pPr>
+      <w:r>
+        <w:t xml:space="preserve">        RAISE EXCEPTION 'Ruumi kattuvuse kontroll ei rakendunud.';</w:t>
+      </w:r>
+    </w:p>
+    <w:p>
+      <w:pPr>
+        <w:pStyle w:val="SqlCode"/>
+      </w:pPr>
+      <w:r>
+        <w:t xml:space="preserve">    END IF;</w:t>
       </w:r>
     </w:p>
     <w:p>
@@ -28063,39 +29155,159 @@
         <w:pStyle w:val="SqlCode"/>
       </w:pPr>
       <w:r>
-        <w:t>UPDATE treeningukord</w:t>
-      </w:r>
-    </w:p>
-    <w:p>
-      <w:pPr>
-        <w:pStyle w:val="SqlCode"/>
-      </w:pPr>
-      <w:r>
-        <w:t>SET seisundi_kood = 'TOIMUNUD',</w:t>
-      </w:r>
-    </w:p>
-    <w:p>
-      <w:pPr>
-        <w:pStyle w:val="SqlCode"/>
-      </w:pPr>
-      <w:r>
-        <w:t xml:space="preserve">    viimase_muutmise_aeg = CURRENT_TIMESTAMP</w:t>
-      </w:r>
-    </w:p>
-    <w:p>
-      <w:pPr>
-        <w:pStyle w:val="SqlCode"/>
-      </w:pPr>
-      <w:r>
-        <w:t>WHERE treeningukorra_kood = 2003</w:t>
-      </w:r>
-    </w:p>
-    <w:p>
-      <w:pPr>
-        <w:pStyle w:val="SqlCode"/>
-      </w:pPr>
-      <w:r>
-        <w:t xml:space="preserve">  AND seisundi_kood = 'SULETUD';</w:t>
+        <w:t xml:space="preserve">    v_failed := FALSE;</w:t>
+      </w:r>
+    </w:p>
+    <w:p>
+      <w:pPr>
+        <w:pStyle w:val="SqlCode"/>
+      </w:pPr>
+      <w:r>
+        <w:t xml:space="preserve">    BEGIN</w:t>
+      </w:r>
+    </w:p>
+    <w:p>
+      <w:pPr>
+        <w:pStyle w:val="SqlCode"/>
+      </w:pPr>
+      <w:r>
+        <w:t xml:space="preserve">        PERFORM fn_planeeri_treeningukord(</w:t>
+      </w:r>
+    </w:p>
+    <w:p>
+      <w:pPr>
+        <w:pStyle w:val="SqlCode"/>
+      </w:pPr>
+      <w:r>
+        <w:t xml:space="preserve">            1002,</w:t>
+      </w:r>
+    </w:p>
+    <w:p>
+      <w:pPr>
+        <w:pStyle w:val="SqlCode"/>
+      </w:pPr>
+      <w:r>
+        <w:t xml:space="preserve">            'treener2@jousaal.ee',</w:t>
+      </w:r>
+    </w:p>
+    <w:p>
+      <w:pPr>
+        <w:pStyle w:val="SqlCode"/>
+      </w:pPr>
+      <w:r>
+        <w:t xml:space="preserve">            'SAAL_A',</w:t>
+      </w:r>
+    </w:p>
+    <w:p>
+      <w:pPr>
+        <w:pStyle w:val="SqlCode"/>
+      </w:pPr>
+      <w:r>
+        <w:t xml:space="preserve">            CURRENT_TIMESTAMP + INTERVAL '12 days',</w:t>
+      </w:r>
+    </w:p>
+    <w:p>
+      <w:pPr>
+        <w:pStyle w:val="SqlCode"/>
+      </w:pPr>
+      <w:r>
+        <w:t xml:space="preserve">            CURRENT_TIMESTAMP + INTERVAL '12 days 75 minutes',</w:t>
+      </w:r>
+    </w:p>
+    <w:p>
+      <w:pPr>
+        <w:pStyle w:val="SqlCode"/>
+      </w:pPr>
+      <w:r>
+        <w:t xml:space="preserve">            CURRENT_TIMESTAMP + INTERVAL '11 days',</w:t>
+      </w:r>
+    </w:p>
+    <w:p>
+      <w:pPr>
+        <w:pStyle w:val="SqlCode"/>
+      </w:pPr>
+      <w:r>
+        <w:t xml:space="preserve">            CURRENT_TIMESTAMP + INTERVAL '11 days',</w:t>
+      </w:r>
+    </w:p>
+    <w:p>
+      <w:pPr>
+        <w:pStyle w:val="SqlCode"/>
+      </w:pPr>
+      <w:r>
+        <w:t xml:space="preserve">            2,</w:t>
+      </w:r>
+    </w:p>
+    <w:p>
+      <w:pPr>
+        <w:pStyle w:val="SqlCode"/>
+      </w:pPr>
+      <w:r>
+        <w:t xml:space="preserve">            'juhataja@jousaal.ee'</w:t>
+      </w:r>
+    </w:p>
+    <w:p>
+      <w:pPr>
+        <w:pStyle w:val="SqlCode"/>
+      </w:pPr>
+      <w:r>
+        <w:t xml:space="preserve">        );</w:t>
+      </w:r>
+    </w:p>
+    <w:p>
+      <w:pPr>
+        <w:pStyle w:val="SqlCode"/>
+      </w:pPr>
+      <w:r>
+        <w:t xml:space="preserve">    EXCEPTION WHEN others THEN</w:t>
+      </w:r>
+    </w:p>
+    <w:p>
+      <w:pPr>
+        <w:pStyle w:val="SqlCode"/>
+      </w:pPr>
+      <w:r>
+        <w:t xml:space="preserve">        v_failed := TRUE;</w:t>
+      </w:r>
+    </w:p>
+    <w:p>
+      <w:pPr>
+        <w:pStyle w:val="SqlCode"/>
+      </w:pPr>
+      <w:r>
+        <w:t xml:space="preserve">        RAISE NOTICE 'Oodatud varustuse kontroll: %', SQLERRM;</w:t>
+      </w:r>
+    </w:p>
+    <w:p>
+      <w:pPr>
+        <w:pStyle w:val="SqlCode"/>
+      </w:pPr>
+      <w:r>
+        <w:t xml:space="preserve">    END;</w:t>
+      </w:r>
+    </w:p>
+    <w:p>
+      <w:pPr>
+        <w:pStyle w:val="SqlCode"/>
+      </w:pPr>
+      <w:r>
+        <w:t xml:space="preserve">    IF NOT v_failed THEN</w:t>
+      </w:r>
+    </w:p>
+    <w:p>
+      <w:pPr>
+        <w:pStyle w:val="SqlCode"/>
+      </w:pPr>
+      <w:r>
+        <w:t xml:space="preserve">        RAISE EXCEPTION 'Varustuse kontroll ei rakendunud.';</w:t>
+      </w:r>
+    </w:p>
+    <w:p>
+      <w:pPr>
+        <w:pStyle w:val="SqlCode"/>
+      </w:pPr>
+      <w:r>
+        <w:t xml:space="preserve">    END IF;</w:t>
       </w:r>
     </w:p>
     <w:p>
@@ -28109,111 +29321,95 @@
         <w:pStyle w:val="SqlCode"/>
       </w:pPr>
       <w:r>
-        <w:t>INSERT INTO registreering (</w:t>
-      </w:r>
-    </w:p>
-    <w:p>
-      <w:pPr>
-        <w:pStyle w:val="SqlCode"/>
-      </w:pPr>
-      <w:r>
-        <w:t xml:space="preserve">    registreeringu_kood,</w:t>
-      </w:r>
-    </w:p>
-    <w:p>
-      <w:pPr>
-        <w:pStyle w:val="SqlCode"/>
-      </w:pPr>
-      <w:r>
-        <w:t xml:space="preserve">    treeningukorra_kood,</w:t>
-      </w:r>
-    </w:p>
-    <w:p>
-      <w:pPr>
-        <w:pStyle w:val="SqlCode"/>
-      </w:pPr>
-      <w:r>
-        <w:t xml:space="preserve">    klient_e_meil,</w:t>
-      </w:r>
-    </w:p>
-    <w:p>
-      <w:pPr>
-        <w:pStyle w:val="SqlCode"/>
-      </w:pPr>
-      <w:r>
-        <w:t xml:space="preserve">    seisundi_kood,</w:t>
-      </w:r>
-    </w:p>
-    <w:p>
-      <w:pPr>
-        <w:pStyle w:val="SqlCode"/>
-      </w:pPr>
-      <w:r>
-        <w:t xml:space="preserve">    ootejarjekorra_nr</w:t>
-      </w:r>
-    </w:p>
-    <w:p>
-      <w:pPr>
-        <w:pStyle w:val="SqlCode"/>
-      </w:pPr>
-      <w:r>
-        <w:t>)</w:t>
-      </w:r>
-    </w:p>
-    <w:p>
-      <w:pPr>
-        <w:pStyle w:val="SqlCode"/>
-      </w:pPr>
-      <w:r>
-        <w:t>VALUES</w:t>
-      </w:r>
-    </w:p>
-    <w:p>
-      <w:pPr>
-        <w:pStyle w:val="SqlCode"/>
-      </w:pPr>
-      <w:r>
-        <w:t>(3000, 2002, 'klient@jousaal.ee', 'KINNIT', NULL),</w:t>
-      </w:r>
-    </w:p>
-    <w:p>
-      <w:pPr>
-        <w:pStyle w:val="SqlCode"/>
-      </w:pPr>
-      <w:r>
-        <w:t>(3001, 2002, 'klient2@jousaal.ee', 'KINNIT', NULL),</w:t>
-      </w:r>
-    </w:p>
-    <w:p>
-      <w:pPr>
-        <w:pStyle w:val="SqlCode"/>
-      </w:pPr>
-      <w:r>
-        <w:t>(3002, 2002, 'klient3@jousaal.ee', 'OOTEJRK', 1),</w:t>
-      </w:r>
-    </w:p>
-    <w:p>
-      <w:pPr>
-        <w:pStyle w:val="SqlCode"/>
-      </w:pPr>
-      <w:r>
-        <w:t>(3003, 2003, 'klient@jousaal.ee', 'KINNIT', NULL),</w:t>
-      </w:r>
-    </w:p>
-    <w:p>
-      <w:pPr>
-        <w:pStyle w:val="SqlCode"/>
-      </w:pPr>
-      <w:r>
-        <w:t>(3004, 2003, 'klient2@jousaal.ee', 'KINNIT', NULL)</w:t>
-      </w:r>
-    </w:p>
-    <w:p>
-      <w:pPr>
-        <w:pStyle w:val="SqlCode"/>
-      </w:pPr>
-      <w:r>
-        <w:t>ON CONFLICT DO NOTHING;</w:t>
+        <w:t xml:space="preserve">    v_failed := FALSE;</w:t>
+      </w:r>
+    </w:p>
+    <w:p>
+      <w:pPr>
+        <w:pStyle w:val="SqlCode"/>
+      </w:pPr>
+      <w:r>
+        <w:t xml:space="preserve">    BEGIN</w:t>
+      </w:r>
+    </w:p>
+    <w:p>
+      <w:pPr>
+        <w:pStyle w:val="SqlCode"/>
+      </w:pPr>
+      <w:r>
+        <w:t xml:space="preserve">        INSERT INTO registreering (treeningukorra_kood, klient_e_meil, seisundi_kood)</w:t>
+      </w:r>
+    </w:p>
+    <w:p>
+      <w:pPr>
+        <w:pStyle w:val="SqlCode"/>
+      </w:pPr>
+      <w:r>
+        <w:t xml:space="preserve">        VALUES (2002, 'klient@jousaal.ee', 'KINNIT');</w:t>
+      </w:r>
+    </w:p>
+    <w:p>
+      <w:pPr>
+        <w:pStyle w:val="SqlCode"/>
+      </w:pPr>
+      <w:r>
+        <w:t xml:space="preserve">    EXCEPTION WHEN others THEN</w:t>
+      </w:r>
+    </w:p>
+    <w:p>
+      <w:pPr>
+        <w:pStyle w:val="SqlCode"/>
+      </w:pPr>
+      <w:r>
+        <w:t xml:space="preserve">        v_failed := TRUE;</w:t>
+      </w:r>
+    </w:p>
+    <w:p>
+      <w:pPr>
+        <w:pStyle w:val="SqlCode"/>
+      </w:pPr>
+      <w:r>
+        <w:t xml:space="preserve">        RAISE NOTICE 'Oodatud topeltregistreeringu kontroll: %', SQLERRM;</w:t>
+      </w:r>
+    </w:p>
+    <w:p>
+      <w:pPr>
+        <w:pStyle w:val="SqlCode"/>
+      </w:pPr>
+      <w:r>
+        <w:t xml:space="preserve">    END;</w:t>
+      </w:r>
+    </w:p>
+    <w:p>
+      <w:pPr>
+        <w:pStyle w:val="SqlCode"/>
+      </w:pPr>
+      <w:r>
+        <w:t xml:space="preserve">    IF NOT v_failed THEN</w:t>
+      </w:r>
+    </w:p>
+    <w:p>
+      <w:pPr>
+        <w:pStyle w:val="SqlCode"/>
+      </w:pPr>
+      <w:r>
+        <w:t xml:space="preserve">        RAISE EXCEPTION 'Topeltregistreeringu kontroll ei rakendunud.';</w:t>
+      </w:r>
+    </w:p>
+    <w:p>
+      <w:pPr>
+        <w:pStyle w:val="SqlCode"/>
+      </w:pPr>
+      <w:r>
+        <w:t xml:space="preserve">    END IF;</w:t>
+      </w:r>
+    </w:p>
+    <w:p>
+      <w:pPr>
+        <w:pStyle w:val="SqlCode"/>
+      </w:pPr>
+      <w:r>
+        <w:t>END $$;</w:t>
       </w:r>
     </w:p>
     <w:p>
@@ -28227,7 +29423,71 @@
         <w:pStyle w:val="SqlCode"/>
       </w:pPr>
       <w:r>
-        <w:t>SELECT setval('seq_registreeringu_kood', GREATEST((SELECT COALESCE(MAX(registreeringu_kood), 2999) FROM registreering), 2999), TRUE);</w:t>
+        <w:t>DO $$</w:t>
+      </w:r>
+    </w:p>
+    <w:p>
+      <w:pPr>
+        <w:pStyle w:val="SqlCode"/>
+      </w:pPr>
+      <w:r>
+        <w:t>BEGIN</w:t>
+      </w:r>
+    </w:p>
+    <w:p>
+      <w:pPr>
+        <w:pStyle w:val="SqlCode"/>
+      </w:pPr>
+      <w:r>
+        <w:t xml:space="preserve">    BEGIN</w:t>
+      </w:r>
+    </w:p>
+    <w:p>
+      <w:pPr>
+        <w:pStyle w:val="SqlCode"/>
+      </w:pPr>
+      <w:r>
+        <w:t xml:space="preserve">        CREATE ROLE jousaali_rakendus LOGIN;</w:t>
+      </w:r>
+    </w:p>
+    <w:p>
+      <w:pPr>
+        <w:pStyle w:val="SqlCode"/>
+      </w:pPr>
+      <w:r>
+        <w:t xml:space="preserve">    EXCEPTION WHEN duplicate_object THEN</w:t>
+      </w:r>
+    </w:p>
+    <w:p>
+      <w:pPr>
+        <w:pStyle w:val="SqlCode"/>
+      </w:pPr>
+      <w:r>
+        <w:t xml:space="preserve">        NULL;</w:t>
+      </w:r>
+    </w:p>
+    <w:p>
+      <w:pPr>
+        <w:pStyle w:val="SqlCode"/>
+      </w:pPr>
+      <w:r>
+        <w:t xml:space="preserve">    WHEN insufficient_privilege THEN</w:t>
+      </w:r>
+    </w:p>
+    <w:p>
+      <w:pPr>
+        <w:pStyle w:val="SqlCode"/>
+      </w:pPr>
+      <w:r>
+        <w:t xml:space="preserve">        RAISE NOTICE 'Rolli jousaali_rakendus loomiseks puudub õigus.';</w:t>
+      </w:r>
+    </w:p>
+    <w:p>
+      <w:pPr>
+        <w:pStyle w:val="SqlCode"/>
+      </w:pPr>
+      <w:r>
+        <w:t xml:space="preserve">    END;</w:t>
       </w:r>
     </w:p>
     <w:p>
@@ -28241,39 +29501,63 @@
         <w:pStyle w:val="SqlCode"/>
       </w:pPr>
       <w:r>
-        <w:t>INSERT INTO osalemine (registreeringu_kood, osales, markija_e_meil, markus)</w:t>
-      </w:r>
-    </w:p>
-    <w:p>
-      <w:pPr>
-        <w:pStyle w:val="SqlCode"/>
-      </w:pPr>
-      <w:r>
-        <w:t>VALUES</w:t>
-      </w:r>
-    </w:p>
-    <w:p>
-      <w:pPr>
-        <w:pStyle w:val="SqlCode"/>
-      </w:pPr>
-      <w:r>
-        <w:t>(3003, TRUE, 'treener@jousaal.ee', 'Osales kogu treeningus.'),</w:t>
-      </w:r>
-    </w:p>
-    <w:p>
-      <w:pPr>
-        <w:pStyle w:val="SqlCode"/>
-      </w:pPr>
-      <w:r>
-        <w:t>(3004, FALSE, 'treener@jousaal.ee', 'Puudus ette teatamata.')</w:t>
-      </w:r>
-    </w:p>
-    <w:p>
-      <w:pPr>
-        <w:pStyle w:val="SqlCode"/>
-      </w:pPr>
-      <w:r>
-        <w:t>ON CONFLICT DO NOTHING;</w:t>
+        <w:t xml:space="preserve">    BEGIN</w:t>
+      </w:r>
+    </w:p>
+    <w:p>
+      <w:pPr>
+        <w:pStyle w:val="SqlCode"/>
+      </w:pPr>
+      <w:r>
+        <w:t xml:space="preserve">        CREATE ROLE jousaali_vaatleja LOGIN;</w:t>
+      </w:r>
+    </w:p>
+    <w:p>
+      <w:pPr>
+        <w:pStyle w:val="SqlCode"/>
+      </w:pPr>
+      <w:r>
+        <w:t xml:space="preserve">    EXCEPTION WHEN duplicate_object THEN</w:t>
+      </w:r>
+    </w:p>
+    <w:p>
+      <w:pPr>
+        <w:pStyle w:val="SqlCode"/>
+      </w:pPr>
+      <w:r>
+        <w:t xml:space="preserve">        NULL;</w:t>
+      </w:r>
+    </w:p>
+    <w:p>
+      <w:pPr>
+        <w:pStyle w:val="SqlCode"/>
+      </w:pPr>
+      <w:r>
+        <w:t xml:space="preserve">    WHEN insufficient_privilege THEN</w:t>
+      </w:r>
+    </w:p>
+    <w:p>
+      <w:pPr>
+        <w:pStyle w:val="SqlCode"/>
+      </w:pPr>
+      <w:r>
+        <w:t xml:space="preserve">        RAISE NOTICE 'Rolli jousaali_vaatleja loomiseks puudub õigus.';</w:t>
+      </w:r>
+    </w:p>
+    <w:p>
+      <w:pPr>
+        <w:pStyle w:val="SqlCode"/>
+      </w:pPr>
+      <w:r>
+        <w:t xml:space="preserve">    END;</w:t>
+      </w:r>
+    </w:p>
+    <w:p>
+      <w:pPr>
+        <w:pStyle w:val="SqlCode"/>
+      </w:pPr>
+      <w:r>
+        <w:t>END $$;</w:t>
       </w:r>
     </w:p>
     <w:p>
@@ -28295,22 +29579,6 @@
         <w:pStyle w:val="SqlCode"/>
       </w:pPr>
       <w:r>
-        <w:t>DECLARE</w:t>
-      </w:r>
-    </w:p>
-    <w:p>
-      <w:pPr>
-        <w:pStyle w:val="SqlCode"/>
-      </w:pPr>
-      <w:r>
-        <w:t xml:space="preserve">    v_failed BOOLEAN;</w:t>
-      </w:r>
-    </w:p>
-    <w:p>
-      <w:pPr>
-        <w:pStyle w:val="SqlCode"/>
-      </w:pPr>
-      <w:r>
         <w:t>BEGIN</w:t>
       </w:r>
     </w:p>
@@ -28319,14 +29587,6 @@
         <w:pStyle w:val="SqlCode"/>
       </w:pPr>
       <w:r>
-        <w:t xml:space="preserve">    v_failed := FALSE;</w:t>
-      </w:r>
-    </w:p>
-    <w:p>
-      <w:pPr>
-        <w:pStyle w:val="SqlCode"/>
-      </w:pPr>
-      <w:r>
         <w:t xml:space="preserve">    BEGIN</w:t>
       </w:r>
     </w:p>
@@ -28335,127 +29595,23 @@
         <w:pStyle w:val="SqlCode"/>
       </w:pPr>
       <w:r>
-        <w:t xml:space="preserve">        INSERT INTO treeningukord (</w:t>
-      </w:r>
-    </w:p>
-    <w:p>
-      <w:pPr>
-        <w:pStyle w:val="SqlCode"/>
-      </w:pPr>
-      <w:r>
-        <w:t xml:space="preserve">            treeninguliigi_kood, treener_e_meil, ruumi_kood, alguse_aeg, lopu_aeg,</w:t>
-      </w:r>
-    </w:p>
-    <w:p>
-      <w:pPr>
-        <w:pStyle w:val="SqlCode"/>
-      </w:pPr>
-      <w:r>
-        <w:t xml:space="preserve">            registreerimise_lopp, tyhistamise_lopp, maksimaalne_osalejate_arv,</w:t>
-      </w:r>
-    </w:p>
-    <w:p>
-      <w:pPr>
-        <w:pStyle w:val="SqlCode"/>
-      </w:pPr>
-      <w:r>
-        <w:t xml:space="preserve">            seisundi_kood, looja_e_meil, viimase_muutja_e_meil</w:t>
-      </w:r>
-    </w:p>
-    <w:p>
-      <w:pPr>
-        <w:pStyle w:val="SqlCode"/>
-      </w:pPr>
-      <w:r>
-        <w:t xml:space="preserve">        )</w:t>
-      </w:r>
-    </w:p>
-    <w:p>
-      <w:pPr>
-        <w:pStyle w:val="SqlCode"/>
-      </w:pPr>
-      <w:r>
-        <w:t xml:space="preserve">        VALUES (</w:t>
-      </w:r>
-    </w:p>
-    <w:p>
-      <w:pPr>
-        <w:pStyle w:val="SqlCode"/>
-      </w:pPr>
-      <w:r>
-        <w:t xml:space="preserve">            1000, 'treener@jousaal.ee', 'SAAL_B',</w:t>
-      </w:r>
-    </w:p>
-    <w:p>
-      <w:pPr>
-        <w:pStyle w:val="SqlCode"/>
-      </w:pPr>
-      <w:r>
-        <w:t xml:space="preserve">            CURRENT_TIMESTAMP + INTERVAL '7 days 15 minutes',</w:t>
-      </w:r>
-    </w:p>
-    <w:p>
-      <w:pPr>
-        <w:pStyle w:val="SqlCode"/>
-      </w:pPr>
-      <w:r>
-        <w:t xml:space="preserve">            CURRENT_TIMESTAMP + INTERVAL '7 days 75 minutes',</w:t>
-      </w:r>
-    </w:p>
-    <w:p>
-      <w:pPr>
-        <w:pStyle w:val="SqlCode"/>
-      </w:pPr>
-      <w:r>
-        <w:t xml:space="preserve">            CURRENT_TIMESTAMP + INTERVAL '6 days',</w:t>
-      </w:r>
-    </w:p>
-    <w:p>
-      <w:pPr>
-        <w:pStyle w:val="SqlCode"/>
-      </w:pPr>
-      <w:r>
-        <w:t xml:space="preserve">            CURRENT_TIMESTAMP + INTERVAL '6 days',</w:t>
-      </w:r>
-    </w:p>
-    <w:p>
-      <w:pPr>
-        <w:pStyle w:val="SqlCode"/>
-      </w:pPr>
-      <w:r>
-        <w:t xml:space="preserve">            8, 'KAVAND', 'juhataja@jousaal.ee', 'juhataja@jousaal.ee'</w:t>
-      </w:r>
-    </w:p>
-    <w:p>
-      <w:pPr>
-        <w:pStyle w:val="SqlCode"/>
-      </w:pPr>
-      <w:r>
-        <w:t xml:space="preserve">        );</w:t>
-      </w:r>
-    </w:p>
-    <w:p>
-      <w:pPr>
-        <w:pStyle w:val="SqlCode"/>
-      </w:pPr>
-      <w:r>
-        <w:t xml:space="preserve">    EXCEPTION WHEN others THEN</w:t>
-      </w:r>
-    </w:p>
-    <w:p>
-      <w:pPr>
-        <w:pStyle w:val="SqlCode"/>
-      </w:pPr>
-      <w:r>
-        <w:t xml:space="preserve">        v_failed := TRUE;</w:t>
-      </w:r>
-    </w:p>
-    <w:p>
-      <w:pPr>
-        <w:pStyle w:val="SqlCode"/>
-      </w:pPr>
-      <w:r>
-        <w:t xml:space="preserve">        RAISE NOTICE 'Oodatud treeneri kattuvuse kontroll: %', SQLERRM;</w:t>
+        <w:t xml:space="preserve">        REVOKE CREATE ON SCHEMA public FROM PUBLIC;</w:t>
+      </w:r>
+    </w:p>
+    <w:p>
+      <w:pPr>
+        <w:pStyle w:val="SqlCode"/>
+      </w:pPr>
+      <w:r>
+        <w:t xml:space="preserve">    EXCEPTION WHEN insufficient_privilege THEN</w:t>
+      </w:r>
+    </w:p>
+    <w:p>
+      <w:pPr>
+        <w:pStyle w:val="SqlCode"/>
+      </w:pPr>
+      <w:r>
+        <w:t xml:space="preserve">        RAISE NOTICE 'Public skeemi CREATE õiguse eemaldamiseks puudub õigus.';</w:t>
       </w:r>
     </w:p>
     <w:p>
@@ -28470,30 +29626,6 @@
       <w:pPr>
         <w:pStyle w:val="SqlCode"/>
       </w:pPr>
-      <w:r>
-        <w:t xml:space="preserve">    IF NOT v_failed THEN</w:t>
-      </w:r>
-    </w:p>
-    <w:p>
-      <w:pPr>
-        <w:pStyle w:val="SqlCode"/>
-      </w:pPr>
-      <w:r>
-        <w:t xml:space="preserve">        RAISE EXCEPTION 'Treeneri kattuvuse kontroll ei rakendunud.';</w:t>
-      </w:r>
-    </w:p>
-    <w:p>
-      <w:pPr>
-        <w:pStyle w:val="SqlCode"/>
-      </w:pPr>
-      <w:r>
-        <w:t xml:space="preserve">    END IF;</w:t>
-      </w:r>
-    </w:p>
-    <w:p>
-      <w:pPr>
-        <w:pStyle w:val="SqlCode"/>
-      </w:pPr>
       <w:r/>
     </w:p>
     <w:p>
@@ -28501,14 +29633,6 @@
         <w:pStyle w:val="SqlCode"/>
       </w:pPr>
       <w:r>
-        <w:t xml:space="preserve">    v_failed := FALSE;</w:t>
-      </w:r>
-    </w:p>
-    <w:p>
-      <w:pPr>
-        <w:pStyle w:val="SqlCode"/>
-      </w:pPr>
-      <w:r>
         <w:t xml:space="preserve">    BEGIN</w:t>
       </w:r>
     </w:p>
@@ -28517,127 +29641,23 @@
         <w:pStyle w:val="SqlCode"/>
       </w:pPr>
       <w:r>
-        <w:t xml:space="preserve">        INSERT INTO treeningukord (</w:t>
-      </w:r>
-    </w:p>
-    <w:p>
-      <w:pPr>
-        <w:pStyle w:val="SqlCode"/>
-      </w:pPr>
-      <w:r>
-        <w:t xml:space="preserve">            treeninguliigi_kood, treener_e_meil, ruumi_kood, alguse_aeg, lopu_aeg,</w:t>
-      </w:r>
-    </w:p>
-    <w:p>
-      <w:pPr>
-        <w:pStyle w:val="SqlCode"/>
-      </w:pPr>
-      <w:r>
-        <w:t xml:space="preserve">            registreerimise_lopp, tyhistamise_lopp, maksimaalne_osalejate_arv,</w:t>
-      </w:r>
-    </w:p>
-    <w:p>
-      <w:pPr>
-        <w:pStyle w:val="SqlCode"/>
-      </w:pPr>
-      <w:r>
-        <w:t xml:space="preserve">            seisundi_kood, looja_e_meil, viimase_muutja_e_meil</w:t>
-      </w:r>
-    </w:p>
-    <w:p>
-      <w:pPr>
-        <w:pStyle w:val="SqlCode"/>
-      </w:pPr>
-      <w:r>
-        <w:t xml:space="preserve">        )</w:t>
-      </w:r>
-    </w:p>
-    <w:p>
-      <w:pPr>
-        <w:pStyle w:val="SqlCode"/>
-      </w:pPr>
-      <w:r>
-        <w:t xml:space="preserve">        VALUES (</w:t>
-      </w:r>
-    </w:p>
-    <w:p>
-      <w:pPr>
-        <w:pStyle w:val="SqlCode"/>
-      </w:pPr>
-      <w:r>
-        <w:t xml:space="preserve">            1000, 'treener@jousaal.ee', 'SAAL_B',</w:t>
-      </w:r>
-    </w:p>
-    <w:p>
-      <w:pPr>
-        <w:pStyle w:val="SqlCode"/>
-      </w:pPr>
-      <w:r>
-        <w:t xml:space="preserve">            CURRENT_TIMESTAMP + INTERVAL '10 days 5 minutes',</w:t>
-      </w:r>
-    </w:p>
-    <w:p>
-      <w:pPr>
-        <w:pStyle w:val="SqlCode"/>
-      </w:pPr>
-      <w:r>
-        <w:t xml:space="preserve">            CURRENT_TIMESTAMP + INTERVAL '10 days 55 minutes',</w:t>
-      </w:r>
-    </w:p>
-    <w:p>
-      <w:pPr>
-        <w:pStyle w:val="SqlCode"/>
-      </w:pPr>
-      <w:r>
-        <w:t xml:space="preserve">            CURRENT_TIMESTAMP + INTERVAL '9 days',</w:t>
-      </w:r>
-    </w:p>
-    <w:p>
-      <w:pPr>
-        <w:pStyle w:val="SqlCode"/>
-      </w:pPr>
-      <w:r>
-        <w:t xml:space="preserve">            CURRENT_TIMESTAMP + INTERVAL '9 days',</w:t>
-      </w:r>
-    </w:p>
-    <w:p>
-      <w:pPr>
-        <w:pStyle w:val="SqlCode"/>
-      </w:pPr>
-      <w:r>
-        <w:t xml:space="preserve">            8, 'KAVAND', 'juhataja@jousaal.ee', 'juhataja@jousaal.ee'</w:t>
-      </w:r>
-    </w:p>
-    <w:p>
-      <w:pPr>
-        <w:pStyle w:val="SqlCode"/>
-      </w:pPr>
-      <w:r>
-        <w:t xml:space="preserve">        );</w:t>
-      </w:r>
-    </w:p>
-    <w:p>
-      <w:pPr>
-        <w:pStyle w:val="SqlCode"/>
-      </w:pPr>
-      <w:r>
-        <w:t xml:space="preserve">    EXCEPTION WHEN others THEN</w:t>
-      </w:r>
-    </w:p>
-    <w:p>
-      <w:pPr>
-        <w:pStyle w:val="SqlCode"/>
-      </w:pPr>
-      <w:r>
-        <w:t xml:space="preserve">        v_failed := TRUE;</w:t>
-      </w:r>
-    </w:p>
-    <w:p>
-      <w:pPr>
-        <w:pStyle w:val="SqlCode"/>
-      </w:pPr>
-      <w:r>
-        <w:t xml:space="preserve">        RAISE NOTICE 'Oodatud ruumi kattuvuse kontroll: %', SQLERRM;</w:t>
+        <w:t xml:space="preserve">        ALTER DEFAULT PRIVILEGES REVOKE EXECUTE ON FUNCTIONS FROM PUBLIC;</w:t>
+      </w:r>
+    </w:p>
+    <w:p>
+      <w:pPr>
+        <w:pStyle w:val="SqlCode"/>
+      </w:pPr>
+      <w:r>
+        <w:t xml:space="preserve">    EXCEPTION WHEN insufficient_privilege THEN</w:t>
+      </w:r>
+    </w:p>
+    <w:p>
+      <w:pPr>
+        <w:pStyle w:val="SqlCode"/>
+      </w:pPr>
+      <w:r>
+        <w:t xml:space="preserve">        RAISE NOTICE 'Funktsioonide vaikimisi PUBLIC EXECUTE õiguse eemaldamiseks puudub õigus.';</w:t>
       </w:r>
     </w:p>
     <w:p>
@@ -28652,30 +29672,6 @@
       <w:pPr>
         <w:pStyle w:val="SqlCode"/>
       </w:pPr>
-      <w:r>
-        <w:t xml:space="preserve">    IF NOT v_failed THEN</w:t>
-      </w:r>
-    </w:p>
-    <w:p>
-      <w:pPr>
-        <w:pStyle w:val="SqlCode"/>
-      </w:pPr>
-      <w:r>
-        <w:t xml:space="preserve">        RAISE EXCEPTION 'Ruumi kattuvuse kontroll ei rakendunud.';</w:t>
-      </w:r>
-    </w:p>
-    <w:p>
-      <w:pPr>
-        <w:pStyle w:val="SqlCode"/>
-      </w:pPr>
-      <w:r>
-        <w:t xml:space="preserve">    END IF;</w:t>
-      </w:r>
-    </w:p>
-    <w:p>
-      <w:pPr>
-        <w:pStyle w:val="SqlCode"/>
-      </w:pPr>
       <w:r/>
     </w:p>
     <w:p>
@@ -28683,14 +29679,6 @@
         <w:pStyle w:val="SqlCode"/>
       </w:pPr>
       <w:r>
-        <w:t xml:space="preserve">    v_failed := FALSE;</w:t>
-      </w:r>
-    </w:p>
-    <w:p>
-      <w:pPr>
-        <w:pStyle w:val="SqlCode"/>
-      </w:pPr>
-      <w:r>
         <w:t xml:space="preserve">    BEGIN</w:t>
       </w:r>
     </w:p>
@@ -28699,111 +29687,23 @@
         <w:pStyle w:val="SqlCode"/>
       </w:pPr>
       <w:r>
-        <w:t xml:space="preserve">        PERFORM fn_planeeri_treeningukord(</w:t>
-      </w:r>
-    </w:p>
-    <w:p>
-      <w:pPr>
-        <w:pStyle w:val="SqlCode"/>
-      </w:pPr>
-      <w:r>
-        <w:t xml:space="preserve">            1002,</w:t>
-      </w:r>
-    </w:p>
-    <w:p>
-      <w:pPr>
-        <w:pStyle w:val="SqlCode"/>
-      </w:pPr>
-      <w:r>
-        <w:t xml:space="preserve">            'treener2@jousaal.ee',</w:t>
-      </w:r>
-    </w:p>
-    <w:p>
-      <w:pPr>
-        <w:pStyle w:val="SqlCode"/>
-      </w:pPr>
-      <w:r>
-        <w:t xml:space="preserve">            'SAAL_A',</w:t>
-      </w:r>
-    </w:p>
-    <w:p>
-      <w:pPr>
-        <w:pStyle w:val="SqlCode"/>
-      </w:pPr>
-      <w:r>
-        <w:t xml:space="preserve">            CURRENT_TIMESTAMP + INTERVAL '12 days',</w:t>
-      </w:r>
-    </w:p>
-    <w:p>
-      <w:pPr>
-        <w:pStyle w:val="SqlCode"/>
-      </w:pPr>
-      <w:r>
-        <w:t xml:space="preserve">            CURRENT_TIMESTAMP + INTERVAL '12 days 75 minutes',</w:t>
-      </w:r>
-    </w:p>
-    <w:p>
-      <w:pPr>
-        <w:pStyle w:val="SqlCode"/>
-      </w:pPr>
-      <w:r>
-        <w:t xml:space="preserve">            CURRENT_TIMESTAMP + INTERVAL '11 days',</w:t>
-      </w:r>
-    </w:p>
-    <w:p>
-      <w:pPr>
-        <w:pStyle w:val="SqlCode"/>
-      </w:pPr>
-      <w:r>
-        <w:t xml:space="preserve">            CURRENT_TIMESTAMP + INTERVAL '11 days',</w:t>
-      </w:r>
-    </w:p>
-    <w:p>
-      <w:pPr>
-        <w:pStyle w:val="SqlCode"/>
-      </w:pPr>
-      <w:r>
-        <w:t xml:space="preserve">            2,</w:t>
-      </w:r>
-    </w:p>
-    <w:p>
-      <w:pPr>
-        <w:pStyle w:val="SqlCode"/>
-      </w:pPr>
-      <w:r>
-        <w:t xml:space="preserve">            'juhataja@jousaal.ee'</w:t>
-      </w:r>
-    </w:p>
-    <w:p>
-      <w:pPr>
-        <w:pStyle w:val="SqlCode"/>
-      </w:pPr>
-      <w:r>
-        <w:t xml:space="preserve">        );</w:t>
-      </w:r>
-    </w:p>
-    <w:p>
-      <w:pPr>
-        <w:pStyle w:val="SqlCode"/>
-      </w:pPr>
-      <w:r>
-        <w:t xml:space="preserve">    EXCEPTION WHEN others THEN</w:t>
-      </w:r>
-    </w:p>
-    <w:p>
-      <w:pPr>
-        <w:pStyle w:val="SqlCode"/>
-      </w:pPr>
-      <w:r>
-        <w:t xml:space="preserve">        v_failed := TRUE;</w:t>
-      </w:r>
-    </w:p>
-    <w:p>
-      <w:pPr>
-        <w:pStyle w:val="SqlCode"/>
-      </w:pPr>
-      <w:r>
-        <w:t xml:space="preserve">        RAISE NOTICE 'Oodatud varustuse kontroll: %', SQLERRM;</w:t>
+        <w:t xml:space="preserve">        REVOKE EXECUTE ON ALL FUNCTIONS IN SCHEMA public FROM PUBLIC;</w:t>
+      </w:r>
+    </w:p>
+    <w:p>
+      <w:pPr>
+        <w:pStyle w:val="SqlCode"/>
+      </w:pPr>
+      <w:r>
+        <w:t xml:space="preserve">    EXCEPTION WHEN insufficient_privilege THEN</w:t>
+      </w:r>
+    </w:p>
+    <w:p>
+      <w:pPr>
+        <w:pStyle w:val="SqlCode"/>
+      </w:pPr>
+      <w:r>
+        <w:t xml:space="preserve">        RAISE NOTICE 'Funktsioonide PUBLIC EXECUTE õiguse eemaldamiseks puudub õigus.';</w:t>
       </w:r>
     </w:p>
     <w:p>
@@ -28818,30 +29718,6 @@
       <w:pPr>
         <w:pStyle w:val="SqlCode"/>
       </w:pPr>
-      <w:r>
-        <w:t xml:space="preserve">    IF NOT v_failed THEN</w:t>
-      </w:r>
-    </w:p>
-    <w:p>
-      <w:pPr>
-        <w:pStyle w:val="SqlCode"/>
-      </w:pPr>
-      <w:r>
-        <w:t xml:space="preserve">        RAISE EXCEPTION 'Varustuse kontroll ei rakendunud.';</w:t>
-      </w:r>
-    </w:p>
-    <w:p>
-      <w:pPr>
-        <w:pStyle w:val="SqlCode"/>
-      </w:pPr>
-      <w:r>
-        <w:t xml:space="preserve">    END IF;</w:t>
-      </w:r>
-    </w:p>
-    <w:p>
-      <w:pPr>
-        <w:pStyle w:val="SqlCode"/>
-      </w:pPr>
       <w:r/>
     </w:p>
     <w:p>
@@ -28849,95 +29725,31 @@
         <w:pStyle w:val="SqlCode"/>
       </w:pPr>
       <w:r>
-        <w:t xml:space="preserve">    v_failed := FALSE;</w:t>
-      </w:r>
-    </w:p>
-    <w:p>
-      <w:pPr>
-        <w:pStyle w:val="SqlCode"/>
-      </w:pPr>
-      <w:r>
-        <w:t xml:space="preserve">    BEGIN</w:t>
-      </w:r>
-    </w:p>
-    <w:p>
-      <w:pPr>
-        <w:pStyle w:val="SqlCode"/>
-      </w:pPr>
-      <w:r>
-        <w:t xml:space="preserve">        INSERT INTO registreering (treeningukorra_kood, klient_e_meil, seisundi_kood)</w:t>
-      </w:r>
-    </w:p>
-    <w:p>
-      <w:pPr>
-        <w:pStyle w:val="SqlCode"/>
-      </w:pPr>
-      <w:r>
-        <w:t xml:space="preserve">        VALUES (2002, 'klient@jousaal.ee', 'KINNIT');</w:t>
-      </w:r>
-    </w:p>
-    <w:p>
-      <w:pPr>
-        <w:pStyle w:val="SqlCode"/>
-      </w:pPr>
-      <w:r>
-        <w:t xml:space="preserve">    EXCEPTION WHEN others THEN</w:t>
-      </w:r>
-    </w:p>
-    <w:p>
-      <w:pPr>
-        <w:pStyle w:val="SqlCode"/>
-      </w:pPr>
-      <w:r>
-        <w:t xml:space="preserve">        v_failed := TRUE;</w:t>
-      </w:r>
-    </w:p>
-    <w:p>
-      <w:pPr>
-        <w:pStyle w:val="SqlCode"/>
-      </w:pPr>
-      <w:r>
-        <w:t xml:space="preserve">        RAISE NOTICE 'Oodatud topeltregistreeringu kontroll: %', SQLERRM;</w:t>
-      </w:r>
-    </w:p>
-    <w:p>
-      <w:pPr>
-        <w:pStyle w:val="SqlCode"/>
-      </w:pPr>
-      <w:r>
-        <w:t xml:space="preserve">    END;</w:t>
-      </w:r>
-    </w:p>
-    <w:p>
-      <w:pPr>
-        <w:pStyle w:val="SqlCode"/>
-      </w:pPr>
-      <w:r>
-        <w:t xml:space="preserve">    IF NOT v_failed THEN</w:t>
-      </w:r>
-    </w:p>
-    <w:p>
-      <w:pPr>
-        <w:pStyle w:val="SqlCode"/>
-      </w:pPr>
-      <w:r>
-        <w:t xml:space="preserve">        RAISE EXCEPTION 'Topeltregistreeringu kontroll ei rakendunud.';</w:t>
-      </w:r>
-    </w:p>
-    <w:p>
-      <w:pPr>
-        <w:pStyle w:val="SqlCode"/>
-      </w:pPr>
-      <w:r>
-        <w:t xml:space="preserve">    END IF;</w:t>
-      </w:r>
-    </w:p>
-    <w:p>
-      <w:pPr>
-        <w:pStyle w:val="SqlCode"/>
-      </w:pPr>
-      <w:r>
-        <w:t>END $$;</w:t>
+        <w:t xml:space="preserve">    IF to_regrole('jousaali_rakendus') IS NOT NULL THEN</w:t>
+      </w:r>
+    </w:p>
+    <w:p>
+      <w:pPr>
+        <w:pStyle w:val="SqlCode"/>
+      </w:pPr>
+      <w:r>
+        <w:t xml:space="preserve">        GRANT USAGE ON SCHEMA public TO jousaali_rakendus;</w:t>
+      </w:r>
+    </w:p>
+    <w:p>
+      <w:pPr>
+        <w:pStyle w:val="SqlCode"/>
+      </w:pPr>
+      <w:r>
+        <w:t xml:space="preserve">        GRANT SELECT ON ALL TABLES IN SCHEMA public TO jousaali_rakendus;</w:t>
+      </w:r>
+    </w:p>
+    <w:p>
+      <w:pPr>
+        <w:pStyle w:val="SqlCode"/>
+      </w:pPr>
+      <w:r>
+        <w:t xml:space="preserve">        REVOKE INSERT, UPDATE, DELETE ON ALL TABLES IN SCHEMA public FROM jousaali_rakendus;</w:t>
       </w:r>
     </w:p>
     <w:p>
@@ -28951,287 +29763,175 @@
         <w:pStyle w:val="SqlCode"/>
       </w:pPr>
       <w:r>
-        <w:t>DO $$</w:t>
-      </w:r>
-    </w:p>
-    <w:p>
-      <w:pPr>
-        <w:pStyle w:val="SqlCode"/>
-      </w:pPr>
-      <w:r>
-        <w:t>BEGIN</w:t>
-      </w:r>
-    </w:p>
-    <w:p>
-      <w:pPr>
-        <w:pStyle w:val="SqlCode"/>
-      </w:pPr>
-      <w:r>
-        <w:t xml:space="preserve">    BEGIN</w:t>
-      </w:r>
-    </w:p>
-    <w:p>
-      <w:pPr>
-        <w:pStyle w:val="SqlCode"/>
-      </w:pPr>
-      <w:r>
-        <w:t xml:space="preserve">        CREATE ROLE jousaali_rakendus LOGIN;</w:t>
-      </w:r>
-    </w:p>
-    <w:p>
-      <w:pPr>
-        <w:pStyle w:val="SqlCode"/>
-      </w:pPr>
-      <w:r>
-        <w:t xml:space="preserve">    EXCEPTION WHEN duplicate_object THEN</w:t>
-      </w:r>
-    </w:p>
-    <w:p>
-      <w:pPr>
-        <w:pStyle w:val="SqlCode"/>
-      </w:pPr>
-      <w:r>
-        <w:t xml:space="preserve">        NULL;</w:t>
-      </w:r>
-    </w:p>
-    <w:p>
-      <w:pPr>
-        <w:pStyle w:val="SqlCode"/>
-      </w:pPr>
-      <w:r>
-        <w:t xml:space="preserve">    WHEN insufficient_privilege THEN</w:t>
-      </w:r>
-    </w:p>
-    <w:p>
-      <w:pPr>
-        <w:pStyle w:val="SqlCode"/>
-      </w:pPr>
-      <w:r>
-        <w:t xml:space="preserve">        RAISE NOTICE 'Rolli jousaali_rakendus loomiseks puudub õigus.';</w:t>
-      </w:r>
-    </w:p>
-    <w:p>
-      <w:pPr>
-        <w:pStyle w:val="SqlCode"/>
-      </w:pPr>
-      <w:r>
-        <w:t xml:space="preserve">    END;</w:t>
-      </w:r>
-    </w:p>
-    <w:p>
-      <w:pPr>
-        <w:pStyle w:val="SqlCode"/>
-      </w:pPr>
-      <w:r/>
-    </w:p>
-    <w:p>
-      <w:pPr>
-        <w:pStyle w:val="SqlCode"/>
-      </w:pPr>
-      <w:r>
-        <w:t xml:space="preserve">    BEGIN</w:t>
-      </w:r>
-    </w:p>
-    <w:p>
-      <w:pPr>
-        <w:pStyle w:val="SqlCode"/>
-      </w:pPr>
-      <w:r>
-        <w:t xml:space="preserve">        CREATE ROLE jousaali_vaatleja LOGIN;</w:t>
-      </w:r>
-    </w:p>
-    <w:p>
-      <w:pPr>
-        <w:pStyle w:val="SqlCode"/>
-      </w:pPr>
-      <w:r>
-        <w:t xml:space="preserve">    EXCEPTION WHEN duplicate_object THEN</w:t>
-      </w:r>
-    </w:p>
-    <w:p>
-      <w:pPr>
-        <w:pStyle w:val="SqlCode"/>
-      </w:pPr>
-      <w:r>
-        <w:t xml:space="preserve">        NULL;</w:t>
-      </w:r>
-    </w:p>
-    <w:p>
-      <w:pPr>
-        <w:pStyle w:val="SqlCode"/>
-      </w:pPr>
-      <w:r>
-        <w:t xml:space="preserve">    WHEN insufficient_privilege THEN</w:t>
-      </w:r>
-    </w:p>
-    <w:p>
-      <w:pPr>
-        <w:pStyle w:val="SqlCode"/>
-      </w:pPr>
-      <w:r>
-        <w:t xml:space="preserve">        RAISE NOTICE 'Rolli jousaali_vaatleja loomiseks puudub õigus.';</w:t>
-      </w:r>
-    </w:p>
-    <w:p>
-      <w:pPr>
-        <w:pStyle w:val="SqlCode"/>
-      </w:pPr>
-      <w:r>
-        <w:t xml:space="preserve">    END;</w:t>
-      </w:r>
-    </w:p>
-    <w:p>
-      <w:pPr>
-        <w:pStyle w:val="SqlCode"/>
-      </w:pPr>
-      <w:r>
-        <w:t>END $$;</w:t>
-      </w:r>
-    </w:p>
-    <w:p>
-      <w:pPr>
-        <w:pStyle w:val="SqlCode"/>
-      </w:pPr>
-      <w:r/>
-    </w:p>
-    <w:p>
-      <w:pPr>
-        <w:pStyle w:val="SqlCode"/>
-      </w:pPr>
-      <w:r>
-        <w:t>DO $$</w:t>
-      </w:r>
-    </w:p>
-    <w:p>
-      <w:pPr>
-        <w:pStyle w:val="SqlCode"/>
-      </w:pPr>
-      <w:r>
-        <w:t>BEGIN</w:t>
-      </w:r>
-    </w:p>
-    <w:p>
-      <w:pPr>
-        <w:pStyle w:val="SqlCode"/>
-      </w:pPr>
-      <w:r>
-        <w:t xml:space="preserve">    BEGIN</w:t>
-      </w:r>
-    </w:p>
-    <w:p>
-      <w:pPr>
-        <w:pStyle w:val="SqlCode"/>
-      </w:pPr>
-      <w:r>
-        <w:t xml:space="preserve">        REVOKE CREATE ON SCHEMA public FROM PUBLIC;</w:t>
-      </w:r>
-    </w:p>
-    <w:p>
-      <w:pPr>
-        <w:pStyle w:val="SqlCode"/>
-      </w:pPr>
-      <w:r>
-        <w:t xml:space="preserve">    EXCEPTION WHEN insufficient_privilege THEN</w:t>
-      </w:r>
-    </w:p>
-    <w:p>
-      <w:pPr>
-        <w:pStyle w:val="SqlCode"/>
-      </w:pPr>
-      <w:r>
-        <w:t xml:space="preserve">        RAISE NOTICE 'Public skeemi CREATE õiguse eemaldamiseks puudub õigus.';</w:t>
-      </w:r>
-    </w:p>
-    <w:p>
-      <w:pPr>
-        <w:pStyle w:val="SqlCode"/>
-      </w:pPr>
-      <w:r>
-        <w:t xml:space="preserve">    END;</w:t>
-      </w:r>
-    </w:p>
-    <w:p>
-      <w:pPr>
-        <w:pStyle w:val="SqlCode"/>
-      </w:pPr>
-      <w:r/>
-    </w:p>
-    <w:p>
-      <w:pPr>
-        <w:pStyle w:val="SqlCode"/>
-      </w:pPr>
-      <w:r>
-        <w:t xml:space="preserve">    IF to_regrole('jousaali_rakendus') IS NOT NULL THEN</w:t>
-      </w:r>
-    </w:p>
-    <w:p>
-      <w:pPr>
-        <w:pStyle w:val="SqlCode"/>
-      </w:pPr>
-      <w:r>
-        <w:t xml:space="preserve">        GRANT USAGE ON SCHEMA public TO jousaali_rakendus;</w:t>
-      </w:r>
-    </w:p>
-    <w:p>
-      <w:pPr>
-        <w:pStyle w:val="SqlCode"/>
-      </w:pPr>
-      <w:r>
-        <w:t xml:space="preserve">        GRANT SELECT ON ALL TABLES IN SCHEMA public TO jousaali_rakendus;</w:t>
-      </w:r>
-    </w:p>
-    <w:p>
-      <w:pPr>
-        <w:pStyle w:val="SqlCode"/>
-      </w:pPr>
-      <w:r>
-        <w:t xml:space="preserve">        GRANT USAGE, SELECT ON ALL SEQUENCES IN SCHEMA public TO jousaali_rakendus;</w:t>
-      </w:r>
-    </w:p>
-    <w:p>
-      <w:pPr>
-        <w:pStyle w:val="SqlCode"/>
-      </w:pPr>
-      <w:r>
-        <w:t xml:space="preserve">        GRANT EXECUTE ON ALL FUNCTIONS IN SCHEMA public TO jousaali_rakendus;</w:t>
-      </w:r>
-    </w:p>
-    <w:p>
-      <w:pPr>
-        <w:pStyle w:val="SqlCode"/>
-      </w:pPr>
-      <w:r/>
-    </w:p>
-    <w:p>
-      <w:pPr>
-        <w:pStyle w:val="SqlCode"/>
-      </w:pPr>
-      <w:r>
-        <w:t xml:space="preserve">        -- Prototüübi lihtsustamiseks jääb rakenduse rollile tabelite kirjutusõigus,</w:t>
-      </w:r>
-    </w:p>
-    <w:p>
-      <w:pPr>
-        <w:pStyle w:val="SqlCode"/>
-      </w:pPr>
-      <w:r>
-        <w:t xml:space="preserve">        -- kuid tavapärased töövood kasutavad funktsioone ning ärireeglid on</w:t>
-      </w:r>
-    </w:p>
-    <w:p>
-      <w:pPr>
-        <w:pStyle w:val="SqlCode"/>
-      </w:pPr>
-      <w:r>
-        <w:t xml:space="preserve">        -- dubleeritult kaitstud triggerite ja indeksitega.</w:t>
-      </w:r>
-    </w:p>
-    <w:p>
-      <w:pPr>
-        <w:pStyle w:val="SqlCode"/>
-      </w:pPr>
-      <w:r>
-        <w:t xml:space="preserve">        GRANT INSERT, UPDATE, DELETE ON ALL TABLES IN SCHEMA public TO jousaali_rakendus;</w:t>
+        <w:t xml:space="preserve">        GRANT EXECUTE ON FUNCTION public.fn_kasutajal_on_roll(e_meil_aadress, kood_10) TO jousaali_rakendus;</w:t>
+      </w:r>
+    </w:p>
+    <w:p>
+      <w:pPr>
+        <w:pStyle w:val="SqlCode"/>
+      </w:pPr>
+      <w:r>
+        <w:t xml:space="preserve">        GRANT EXECUTE ON FUNCTION public.fn_on_juhataja(e_meil_aadress) TO jousaali_rakendus;</w:t>
+      </w:r>
+    </w:p>
+    <w:p>
+      <w:pPr>
+        <w:pStyle w:val="SqlCode"/>
+      </w:pPr>
+      <w:r>
+        <w:t xml:space="preserve">        GRANT EXECUTE ON FUNCTION public.fn_on_treener(e_meil_aadress) TO jousaali_rakendus;</w:t>
+      </w:r>
+    </w:p>
+    <w:p>
+      <w:pPr>
+        <w:pStyle w:val="SqlCode"/>
+      </w:pPr>
+      <w:r>
+        <w:t xml:space="preserve">        GRANT EXECUTE ON FUNCTION public.fn_kasutaja_tuvastamise_andmed(e_meil_aadress) TO jousaali_rakendus;</w:t>
+      </w:r>
+    </w:p>
+    <w:p>
+      <w:pPr>
+        <w:pStyle w:val="SqlCode"/>
+      </w:pPr>
+      <w:r>
+        <w:t xml:space="preserve">        GRANT EXECUTE ON FUNCTION public.fn_planeeri_treeningukord(</w:t>
+      </w:r>
+    </w:p>
+    <w:p>
+      <w:pPr>
+        <w:pStyle w:val="SqlCode"/>
+      </w:pPr>
+      <w:r>
+        <w:t xml:space="preserve">            INTEGER,</w:t>
+      </w:r>
+    </w:p>
+    <w:p>
+      <w:pPr>
+        <w:pStyle w:val="SqlCode"/>
+      </w:pPr>
+      <w:r>
+        <w:t xml:space="preserve">            e_meil_aadress,</w:t>
+      </w:r>
+    </w:p>
+    <w:p>
+      <w:pPr>
+        <w:pStyle w:val="SqlCode"/>
+      </w:pPr>
+      <w:r>
+        <w:t xml:space="preserve">            kood_10,</w:t>
+      </w:r>
+    </w:p>
+    <w:p>
+      <w:pPr>
+        <w:pStyle w:val="SqlCode"/>
+      </w:pPr>
+      <w:r>
+        <w:t xml:space="preserve">            TIMESTAMP WITH TIME ZONE,</w:t>
+      </w:r>
+    </w:p>
+    <w:p>
+      <w:pPr>
+        <w:pStyle w:val="SqlCode"/>
+      </w:pPr>
+      <w:r>
+        <w:t xml:space="preserve">            TIMESTAMP WITH TIME ZONE,</w:t>
+      </w:r>
+    </w:p>
+    <w:p>
+      <w:pPr>
+        <w:pStyle w:val="SqlCode"/>
+      </w:pPr>
+      <w:r>
+        <w:t xml:space="preserve">            TIMESTAMP WITH TIME ZONE,</w:t>
+      </w:r>
+    </w:p>
+    <w:p>
+      <w:pPr>
+        <w:pStyle w:val="SqlCode"/>
+      </w:pPr>
+      <w:r>
+        <w:t xml:space="preserve">            TIMESTAMP WITH TIME ZONE,</w:t>
+      </w:r>
+    </w:p>
+    <w:p>
+      <w:pPr>
+        <w:pStyle w:val="SqlCode"/>
+      </w:pPr>
+      <w:r>
+        <w:t xml:space="preserve">            INTEGER,</w:t>
+      </w:r>
+    </w:p>
+    <w:p>
+      <w:pPr>
+        <w:pStyle w:val="SqlCode"/>
+      </w:pPr>
+      <w:r>
+        <w:t xml:space="preserve">            e_meil_aadress</w:t>
+      </w:r>
+    </w:p>
+    <w:p>
+      <w:pPr>
+        <w:pStyle w:val="SqlCode"/>
+      </w:pPr>
+      <w:r>
+        <w:t xml:space="preserve">        ) TO jousaali_rakendus;</w:t>
+      </w:r>
+    </w:p>
+    <w:p>
+      <w:pPr>
+        <w:pStyle w:val="SqlCode"/>
+      </w:pPr>
+      <w:r>
+        <w:t xml:space="preserve">        GRANT EXECUTE ON FUNCTION public.fn_ava_treeningukord(INTEGER, e_meil_aadress) TO jousaali_rakendus;</w:t>
+      </w:r>
+    </w:p>
+    <w:p>
+      <w:pPr>
+        <w:pStyle w:val="SqlCode"/>
+      </w:pPr>
+      <w:r>
+        <w:t xml:space="preserve">        GRANT EXECUTE ON FUNCTION public.fn_sulge_treeningukord(INTEGER, e_meil_aadress) TO jousaali_rakendus;</w:t>
+      </w:r>
+    </w:p>
+    <w:p>
+      <w:pPr>
+        <w:pStyle w:val="SqlCode"/>
+      </w:pPr>
+      <w:r>
+        <w:t xml:space="preserve">        GRANT EXECUTE ON FUNCTION public.fn_lopeta_treeningukord(INTEGER, e_meil_aadress) TO jousaali_rakendus;</w:t>
+      </w:r>
+    </w:p>
+    <w:p>
+      <w:pPr>
+        <w:pStyle w:val="SqlCode"/>
+      </w:pPr>
+      <w:r>
+        <w:t xml:space="preserve">        GRANT EXECUTE ON FUNCTION public.fn_registreeri_klient_treeningukorrale(INTEGER, e_meil_aadress) TO jousaali_rakendus;</w:t>
+      </w:r>
+    </w:p>
+    <w:p>
+      <w:pPr>
+        <w:pStyle w:val="SqlCode"/>
+      </w:pPr>
+      <w:r>
+        <w:t xml:space="preserve">        GRANT EXECUTE ON FUNCTION public.fn_tyhista_registreering(INTEGER, e_meil_aadress, TEXT) TO jousaali_rakendus;</w:t>
+      </w:r>
+    </w:p>
+    <w:p>
+      <w:pPr>
+        <w:pStyle w:val="SqlCode"/>
+      </w:pPr>
+      <w:r>
+        <w:t xml:space="preserve">        GRANT EXECUTE ON FUNCTION public.fn_marki_osalemine(INTEGER, e_meil_aadress, BOOLEAN, TEXT) TO jousaali_rakendus;</w:t>
+      </w:r>
+    </w:p>
+    <w:p>
+      <w:pPr>
+        <w:pStyle w:val="SqlCode"/>
+      </w:pPr>
+      <w:r>
+        <w:t xml:space="preserve">        GRANT EXECUTE ON FUNCTION public.fn_tyhista_treeningukord(INTEGER, e_meil_aadress, TEXT) TO jousaali_rakendus;</w:t>
       </w:r>
     </w:p>
     <w:p>

</xml_diff>

<commit_message>
Revise AI usage and references sections
</commit_message>
<xml_diff>
--- a/Jousaali_infosusteemi_treeningute_funktsionaalne_allsusteem.docx
+++ b/Jousaali_infosusteemi_treeningute_funktsionaalne_allsusteem.docx
@@ -25867,12 +25867,17 @@
     </w:p>
     <w:p>
       <w:r>
-        <w:t>Projekti koostamisel kasutati tehisintellekti abi analüüsi, SQL-skeemi, Mermaid diagrammide, DOCX generaatori ja validaatori iteratiivseks parandamiseks. Tehisintellekti kasutati kavandite ja kontrollnimekirjade koostamiseks, koodi muutmiseks ning vigade otsimiseks.</w:t>
-      </w:r>
-    </w:p>
-    <w:p>
-      <w:r>
-        <w:t>Kõik lõplikud otsused projekti skoobi, andmemudeli, ärireeglite ja esitatavate failide kohta kontrolliti projekti nõuete, lokaalse buildi, staatilise validaatori ning live SQL testidega. Vastutus lõpliku töö õigsuse eest jääb autoritele.</w:t>
+        <w:t>Projekti autorid määrasid töö skoobi, valisid põhiobjektid ja tegutsejad, koostasid kasutusjuhtude sisu, kavandasid andmemudeli, kirjeldasid ärireeglid, vormistasid andmebaasioperatsioonide lepingud ning tegid lõplikud otsused SQL-skeemi, diagrammide ja esitatavate failide kohta. Tehisintellekti kasutati abivahendina autorite loodud lahenduste kontrollimiseks, vastuolude otsimiseks ja tehnilise vormistuse parandamiseks.</w:t>
+      </w:r>
+    </w:p>
+    <w:p>
+      <w:r>
+        <w:t>Tehisintellekti kasutati eelkõige kavandite võrdlemiseks kursuse juhenditega, kontrollnimekirjade koostamiseks, Mermaid diagrammide, DOCX generaatori ja staatilise validaatori tehniliseks parandamiseks, SQL-i vigade otsimiseks ning sõnastuse parendusettepanekute saamiseks. Tehisintellekti väljundeid ei kasutatud iseseisva autoriteetse allikana.</w:t>
+      </w:r>
+    </w:p>
+    <w:p>
+      <w:r>
+        <w:t>Autorid kontrollisid ja valisid kõik lõplikud lahendused ise. Projekti skoopi, andmemudelit, ärireegleid, SQL-i, EAP/DOCX artefakte ja esitatavaid faile kontrolliti kursuse nõuete, lähtejuhendite, lokaalse buildi, staatilise validaatori, EAP ekspordi kontrollide ja PostgreSQL testidega. Vastutus töö sisulise õigsuse eest jääb autoritele.</w:t>
       </w:r>
     </w:p>
     <w:p>
@@ -25884,11 +25889,16 @@
       </w:r>
     </w:p>
     <w:p>
+      <w:r>
+        <w:t>Loetelus on esitatud töö koostamisel kasutatud kursusematerjalid, metoodilised allikad ja tehnilised dokumentatsioonid. Veebiallikate puhul on lisatud URL ja kasutamise kuupäev.</w:t>
+      </w:r>
+    </w:p>
+    <w:p>
       <w:pPr>
         <w:pStyle w:val="ListBullet"/>
       </w:pPr>
       <w:r>
-        <w:t>Erki Eessaare Andmebaasid I kursuse projektijuhendid ja mallid: AB_projekt_Nullist_tegemiseks_2026.doc ning Projekti_juhend_ITI0206_2026.</w:t>
+        <w:t>Eessaar, E. Andmebaasid I kursuse projektijuhendid ja mallid: AB_projekt_Nullist_tegemiseks_2026.doc, Iseseisva_too_ylesande_pystitus_ITI0206_2026.pdf, Projekti_mustripohine_juhend_1_52.pdf, Projekti_tyypvead_ITI0206_2026.pdf ja Naidisprojekt_ITI0206_vastuvotuajad_ver6_44.pdf. Kasutatud projekti struktuuri, kontrollreeglite ja näidete allikana.</w:t>
       </w:r>
     </w:p>
     <w:p>
@@ -25896,7 +25906,7 @@
         <w:pStyle w:val="ListBullet"/>
       </w:pPr>
       <w:r>
-        <w:t>Craig Larman. Applying UML and Patterns. Kasutusjuhtude, tegevusdiagrammide, seisundidiagrammide ja operatsioonilepingute vormistuslik taust.</w:t>
+        <w:t>TalTech raamatukogu. Kirjalike tööde vormistamine, viitamine. https://taltech.ee/raamatukogu/kirjalike-toode-vormistamine (kasutatud 29.05.2026). Kasutatud allikate loetelu vormistusnõuete kontrollimiseks.</w:t>
       </w:r>
     </w:p>
     <w:p>
@@ -25904,7 +25914,7 @@
         <w:pStyle w:val="ListBullet"/>
       </w:pPr>
       <w:r>
-        <w:t>AKIT terminibaas mittefunktsionaalsete nõuete mõistete selgitamiseks.</w:t>
+        <w:t>Larman, C. Applying UML and Patterns: An Introduction to Object-Oriented Analysis and Design and Iterative Development. 3rd ed. Pearson, 2005. Kasutatud kasutusjuhtude, tegevusdiagrammide, seisundidiagrammide ja operatsioonilepingute metoodilise taustana.</w:t>
       </w:r>
     </w:p>
     <w:p>
@@ -25912,7 +25922,31 @@
         <w:pStyle w:val="ListBullet"/>
       </w:pPr>
       <w:r>
-        <w:t>PostgreSQL dokumentatsioon PL/pgSQL, triggerite, vaadete, indeksite ja piirangute kohta.</w:t>
+        <w:t>Eesti Keele Instituut. AKIT - andmekaitse ja infoturbe leksikon. https://akit.cyber.ee/ (kasutatud 29.05.2026). Kasutatud mittefunktsionaalsete nõuete ja infoturbe mõistete täpsustamiseks.</w:t>
+      </w:r>
+    </w:p>
+    <w:p>
+      <w:pPr>
+        <w:pStyle w:val="ListBullet"/>
+      </w:pPr>
+      <w:r>
+        <w:t>PostgreSQL Global Development Group. PostgreSQL 16 Documentation. https://www.postgresql.org/docs/16/ (kasutatud 29.05.2026). Kasutatud PL/pgSQL, triggerite, vaadete, indeksite ja piirangute tehnilise alusmaterjalina.</w:t>
+      </w:r>
+    </w:p>
+    <w:p>
+      <w:pPr>
+        <w:pStyle w:val="ListBullet"/>
+      </w:pPr>
+      <w:r>
+        <w:t>Mermaid. Mermaid documentation. https://mermaid.js.org/intro/ (kasutatud 29.05.2026). Kasutatud Mermaid diagrammide süntaksi kontrollimiseks.</w:t>
+      </w:r>
+    </w:p>
+    <w:p>
+      <w:pPr>
+        <w:pStyle w:val="ListBullet"/>
+      </w:pPr>
+      <w:r>
+        <w:t>python-docx contributors. python-docx documentation. https://python-docx.readthedocs.io/ (kasutatud 29.05.2026). Kasutatud DOCX generaatori tehnilise dokumentatsioonina.</w:t>
       </w:r>
     </w:p>
     <w:p>

</xml_diff>